<commit_message>
Add bilingual docs and version archive
</commit_message>
<xml_diff>
--- a/templates/Harvest_Smart_Invoice_Template_Strict.docx
+++ b/templates/Harvest_Smart_Invoice_Template_Strict.docx
@@ -86,7 +86,7 @@
                 <wp:inline distB="0" distT="0" distL="114300" distR="114300">
                   <wp:extent cx="2880360" cy="1002596"/>
                   <wp:effectExtent b="0" l="0" r="0" t="0"/>
-                  <wp:docPr id="1" name="image1.png"/>
+                  <wp:docPr id="2" name="image1.png"/>
                   <a:graphic>
                     <a:graphicData uri="http://schemas.openxmlformats.org/drawingml/2006/picture">
                       <pic:pic>
@@ -163,7 +163,10 @@
             <w:pPr>
               <w:spacing w:after="0" w:before="80" w:line="240" w:lineRule="auto"/>
               <w:jc w:val="right"/>
-              <w:rPr/>
+              <w:rPr>
+                <w:sz w:val="21"/>
+                <w:szCs w:val="21"/>
+              </w:rPr>
             </w:pPr>
             <w:r>
               <w:rPr>
@@ -173,8 +176,6 @@
                 <w:i w:val="0"/>
                 <w:iCs w:val="0"/>
                 <w:color w:val="666666"/>
-                <w:sz w:val="17"/>
-                <w:szCs w:val="17"/>
                 <w:rtl w:val="0"/>
               </w:rPr>
               <w:t xml:space="preserve">Invoice #  </w:t>
@@ -187,8 +188,8 @@
                 <w:i w:val="0"/>
                 <w:iCs w:val="0"/>
                 <w:color w:val="303030"/>
-                <w:sz w:val="19"/>
-                <w:szCs w:val="19"/>
+                <w:sz w:val="21"/>
+                <w:szCs w:val="21"/>
                 <w:rtl w:val="0"/>
               </w:rPr>
               <w:t xml:space="preserve">{{INVOICE_NUMBER}}</w:t>
@@ -203,7 +204,10 @@
             <w:pPr>
               <w:spacing w:after="0" w:before="20" w:line="240" w:lineRule="auto"/>
               <w:jc w:val="right"/>
-              <w:rPr/>
+              <w:rPr>
+                <w:sz w:val="21"/>
+                <w:szCs w:val="21"/>
+              </w:rPr>
             </w:pPr>
             <w:r>
               <w:rPr>
@@ -213,8 +217,6 @@
                 <w:i w:val="0"/>
                 <w:iCs w:val="0"/>
                 <w:color w:val="666666"/>
-                <w:sz w:val="17"/>
-                <w:szCs w:val="17"/>
                 <w:rtl w:val="0"/>
               </w:rPr>
               <w:t xml:space="preserve">Invoice Date  </w:t>
@@ -227,8 +229,8 @@
                 <w:i w:val="0"/>
                 <w:iCs w:val="0"/>
                 <w:color w:val="303030"/>
-                <w:sz w:val="19"/>
-                <w:szCs w:val="19"/>
+                <w:sz w:val="21"/>
+                <w:szCs w:val="21"/>
                 <w:rtl w:val="0"/>
               </w:rPr>
               <w:t xml:space="preserve">{{INVOICE_DATE}}</w:t>
@@ -243,7 +245,10 @@
             <w:pPr>
               <w:spacing w:after="0" w:before="20" w:line="240" w:lineRule="auto"/>
               <w:jc w:val="right"/>
-              <w:rPr/>
+              <w:rPr>
+                <w:sz w:val="21"/>
+                <w:szCs w:val="21"/>
+              </w:rPr>
             </w:pPr>
             <w:r>
               <w:rPr>
@@ -253,8 +258,6 @@
                 <w:i w:val="0"/>
                 <w:iCs w:val="0"/>
                 <w:color w:val="666666"/>
-                <w:sz w:val="17"/>
-                <w:szCs w:val="17"/>
                 <w:rtl w:val="0"/>
               </w:rPr>
               <w:t xml:space="preserve">Due Date  </w:t>
@@ -267,8 +270,8 @@
                 <w:i w:val="0"/>
                 <w:iCs w:val="0"/>
                 <w:color w:val="303030"/>
-                <w:sz w:val="19"/>
-                <w:szCs w:val="19"/>
+                <w:sz w:val="21"/>
+                <w:szCs w:val="21"/>
                 <w:rtl w:val="0"/>
               </w:rPr>
               <w:t xml:space="preserve">{{DUE_DATE}}</w:t>
@@ -285,13 +288,16 @@
     <w:p>
       <w:pPr>
         <w:spacing w:after="180" w:before="100" w:line="240" w:lineRule="auto"/>
-        <w:rPr/>
+        <w:rPr>
+          <w:sz w:val="21"/>
+          <w:szCs w:val="21"/>
+        </w:rPr>
       </w:pPr>
       <w:r>
         <w:rPr>
           <w:color w:val="666666"/>
-          <w:sz w:val="16"/>
-          <w:szCs w:val="16"/>
+          <w:sz w:val="18"/>
+          <w:szCs w:val="18"/>
           <w:rtl w:val="0"/>
         </w:rPr>
         <w:t xml:space="preserve">LogFresh Biotechnology CO., LTD</w:t>
@@ -304,8 +310,8 @@
           <w:i w:val="0"/>
           <w:iCs w:val="0"/>
           <w:color w:val="666666"/>
-          <w:sz w:val="16"/>
-          <w:szCs w:val="16"/>
+          <w:sz w:val="18"/>
+          <w:szCs w:val="18"/>
           <w:rtl w:val="0"/>
         </w:rPr>
         <w:t xml:space="preserve"> ·  </w:t>
@@ -313,11 +319,11 @@
       <w:r>
         <w:rPr>
           <w:color w:val="666666"/>
-          <w:sz w:val="16"/>
-          <w:szCs w:val="16"/>
+          <w:sz w:val="18"/>
+          <w:szCs w:val="18"/>
           <w:rtl w:val="0"/>
         </w:rPr>
-        <w:t xml:space="preserve">2312 Banks Drive, Woodland, CA 95776</w:t>
+        <w:t xml:space="preserve">708 N 29th Avenue, Unit2, Yakima, WA 98902  </w:t>
       </w:r>
       <w:r>
         <w:rPr>
@@ -327,17 +333,17 @@
           <w:i w:val="0"/>
           <w:iCs w:val="0"/>
           <w:color w:val="666666"/>
-          <w:sz w:val="16"/>
-          <w:szCs w:val="16"/>
+          <w:sz w:val="18"/>
+          <w:szCs w:val="18"/>
           <w:rtl w:val="0"/>
         </w:rPr>
-        <w:t xml:space="preserve"> · 215-696-1238  ·  </w:t>
+        <w:t xml:space="preserve">· 215-696-1238  ·  </w:t>
       </w:r>
       <w:r>
         <w:rPr>
           <w:color w:val="666666"/>
-          <w:sz w:val="16"/>
-          <w:szCs w:val="16"/>
+          <w:sz w:val="18"/>
+          <w:szCs w:val="18"/>
           <w:rtl w:val="0"/>
         </w:rPr>
         <w:t xml:space="preserve">sales@awt-biotech.com</w:t>
@@ -386,7 +392,10 @@
           <w:p>
             <w:pPr>
               <w:spacing w:after="40" w:before="0" w:line="240" w:lineRule="auto"/>
-              <w:rPr/>
+              <w:rPr>
+                <w:sz w:val="21"/>
+                <w:szCs w:val="21"/>
+              </w:rPr>
             </w:pPr>
             <w:r>
               <w:rPr>
@@ -396,8 +405,8 @@
                 <w:i w:val="0"/>
                 <w:iCs w:val="0"/>
                 <w:color w:val="42ad3a"/>
-                <w:sz w:val="18"/>
-                <w:szCs w:val="18"/>
+                <w:sz w:val="20"/>
+                <w:szCs w:val="20"/>
                 <w:rtl w:val="0"/>
               </w:rPr>
               <w:t xml:space="preserve">BILL TO</w:t>
@@ -411,7 +420,10 @@
           <w:p>
             <w:pPr>
               <w:spacing w:after="0" w:before="0" w:line="246.99999999999994" w:lineRule="auto"/>
-              <w:rPr/>
+              <w:rPr>
+                <w:sz w:val="21"/>
+                <w:szCs w:val="21"/>
+              </w:rPr>
             </w:pPr>
             <w:r>
               <w:rPr>
@@ -421,8 +433,8 @@
                 <w:i w:val="0"/>
                 <w:iCs w:val="0"/>
                 <w:color w:val="303030"/>
-                <w:sz w:val="18"/>
-                <w:szCs w:val="18"/>
+                <w:sz w:val="20"/>
+                <w:szCs w:val="20"/>
                 <w:rtl w:val="0"/>
               </w:rPr>
               <w:t xml:space="preserve">{{BILL_TO_NAME}}</w:t>
@@ -436,7 +448,10 @@
           <w:p>
             <w:pPr>
               <w:spacing w:after="0" w:before="0" w:line="246.99999999999994" w:lineRule="auto"/>
-              <w:rPr/>
+              <w:rPr>
+                <w:sz w:val="21"/>
+                <w:szCs w:val="21"/>
+              </w:rPr>
             </w:pPr>
             <w:r>
               <w:rPr>
@@ -446,8 +461,8 @@
                 <w:i w:val="0"/>
                 <w:iCs w:val="0"/>
                 <w:color w:val="303030"/>
-                <w:sz w:val="18"/>
-                <w:szCs w:val="18"/>
+                <w:sz w:val="20"/>
+                <w:szCs w:val="20"/>
                 <w:rtl w:val="0"/>
               </w:rPr>
               <w:t xml:space="preserve">{{BILL_TO_COMPANY}}</w:t>
@@ -461,7 +476,10 @@
           <w:p>
             <w:pPr>
               <w:spacing w:after="0" w:before="0" w:line="246.99999999999994" w:lineRule="auto"/>
-              <w:rPr/>
+              <w:rPr>
+                <w:sz w:val="21"/>
+                <w:szCs w:val="21"/>
+              </w:rPr>
             </w:pPr>
             <w:r>
               <w:rPr>
@@ -471,8 +489,8 @@
                 <w:i w:val="0"/>
                 <w:iCs w:val="0"/>
                 <w:color w:val="303030"/>
-                <w:sz w:val="18"/>
-                <w:szCs w:val="18"/>
+                <w:sz w:val="20"/>
+                <w:szCs w:val="20"/>
                 <w:rtl w:val="0"/>
               </w:rPr>
               <w:t xml:space="preserve">{{BILL_TO_ADDRESS}}</w:t>
@@ -486,7 +504,10 @@
           <w:p>
             <w:pPr>
               <w:spacing w:after="0" w:before="0" w:line="246.99999999999994" w:lineRule="auto"/>
-              <w:rPr/>
+              <w:rPr>
+                <w:sz w:val="21"/>
+                <w:szCs w:val="21"/>
+              </w:rPr>
             </w:pPr>
             <w:r>
               <w:rPr>
@@ -496,8 +517,8 @@
                 <w:i w:val="0"/>
                 <w:iCs w:val="0"/>
                 <w:color w:val="303030"/>
-                <w:sz w:val="18"/>
-                <w:szCs w:val="18"/>
+                <w:sz w:val="20"/>
+                <w:szCs w:val="20"/>
                 <w:rtl w:val="0"/>
               </w:rPr>
               <w:t xml:space="preserve">{{BILL_TO_CITY_STATE_ZIP}}</w:t>
@@ -511,7 +532,10 @@
           <w:p>
             <w:pPr>
               <w:spacing w:after="0" w:before="0" w:line="246.99999999999994" w:lineRule="auto"/>
-              <w:rPr/>
+              <w:rPr>
+                <w:sz w:val="21"/>
+                <w:szCs w:val="21"/>
+              </w:rPr>
             </w:pPr>
             <w:r>
               <w:rPr>
@@ -521,8 +545,8 @@
                 <w:i w:val="0"/>
                 <w:iCs w:val="0"/>
                 <w:color w:val="303030"/>
-                <w:sz w:val="18"/>
-                <w:szCs w:val="18"/>
+                <w:sz w:val="20"/>
+                <w:szCs w:val="20"/>
                 <w:rtl w:val="0"/>
               </w:rPr>
               <w:t xml:space="preserve">{{BILL_TO_PHONE}}  ·  {{BILL_TO_EMAIL}}</w:t>
@@ -549,7 +573,10 @@
           <w:p>
             <w:pPr>
               <w:spacing w:after="40" w:before="0" w:line="240" w:lineRule="auto"/>
-              <w:rPr/>
+              <w:rPr>
+                <w:sz w:val="21"/>
+                <w:szCs w:val="21"/>
+              </w:rPr>
             </w:pPr>
             <w:r>
               <w:rPr>
@@ -559,8 +586,8 @@
                 <w:i w:val="0"/>
                 <w:iCs w:val="0"/>
                 <w:color w:val="42ad3a"/>
-                <w:sz w:val="18"/>
-                <w:szCs w:val="18"/>
+                <w:sz w:val="20"/>
+                <w:szCs w:val="20"/>
                 <w:rtl w:val="0"/>
               </w:rPr>
               <w:t xml:space="preserve">SHIP TO</w:t>
@@ -574,7 +601,10 @@
           <w:p>
             <w:pPr>
               <w:spacing w:after="0" w:before="0" w:line="246.99999999999994" w:lineRule="auto"/>
-              <w:rPr/>
+              <w:rPr>
+                <w:sz w:val="21"/>
+                <w:szCs w:val="21"/>
+              </w:rPr>
             </w:pPr>
             <w:r>
               <w:rPr>
@@ -584,8 +614,8 @@
                 <w:i w:val="0"/>
                 <w:iCs w:val="0"/>
                 <w:color w:val="303030"/>
-                <w:sz w:val="18"/>
-                <w:szCs w:val="18"/>
+                <w:sz w:val="20"/>
+                <w:szCs w:val="20"/>
                 <w:rtl w:val="0"/>
               </w:rPr>
               <w:t xml:space="preserve">{{SHIP_TO_NAME}}</w:t>
@@ -599,7 +629,10 @@
           <w:p>
             <w:pPr>
               <w:spacing w:after="0" w:before="0" w:line="246.99999999999994" w:lineRule="auto"/>
-              <w:rPr/>
+              <w:rPr>
+                <w:sz w:val="21"/>
+                <w:szCs w:val="21"/>
+              </w:rPr>
             </w:pPr>
             <w:r>
               <w:rPr>
@@ -609,8 +642,8 @@
                 <w:i w:val="0"/>
                 <w:iCs w:val="0"/>
                 <w:color w:val="303030"/>
-                <w:sz w:val="18"/>
-                <w:szCs w:val="18"/>
+                <w:sz w:val="20"/>
+                <w:szCs w:val="20"/>
                 <w:rtl w:val="0"/>
               </w:rPr>
               <w:t xml:space="preserve">{{SHIP_TO_COMPANY}}</w:t>
@@ -624,7 +657,10 @@
           <w:p>
             <w:pPr>
               <w:spacing w:after="0" w:before="0" w:line="246.99999999999994" w:lineRule="auto"/>
-              <w:rPr/>
+              <w:rPr>
+                <w:sz w:val="21"/>
+                <w:szCs w:val="21"/>
+              </w:rPr>
             </w:pPr>
             <w:r>
               <w:rPr>
@@ -634,8 +670,8 @@
                 <w:i w:val="0"/>
                 <w:iCs w:val="0"/>
                 <w:color w:val="303030"/>
-                <w:sz w:val="18"/>
-                <w:szCs w:val="18"/>
+                <w:sz w:val="20"/>
+                <w:szCs w:val="20"/>
                 <w:rtl w:val="0"/>
               </w:rPr>
               <w:t xml:space="preserve">{{SHIP_TO_ADDRESS}}</w:t>
@@ -649,7 +685,10 @@
           <w:p>
             <w:pPr>
               <w:spacing w:after="0" w:before="0" w:line="246.99999999999994" w:lineRule="auto"/>
-              <w:rPr/>
+              <w:rPr>
+                <w:sz w:val="21"/>
+                <w:szCs w:val="21"/>
+              </w:rPr>
             </w:pPr>
             <w:r>
               <w:rPr>
@@ -659,8 +698,8 @@
                 <w:i w:val="0"/>
                 <w:iCs w:val="0"/>
                 <w:color w:val="303030"/>
-                <w:sz w:val="18"/>
-                <w:szCs w:val="18"/>
+                <w:sz w:val="20"/>
+                <w:szCs w:val="20"/>
                 <w:rtl w:val="0"/>
               </w:rPr>
               <w:t xml:space="preserve">{{SHIP_TO_CITY_STATE_ZIP}}</w:t>
@@ -674,7 +713,10 @@
           <w:p>
             <w:pPr>
               <w:spacing w:after="0" w:before="0" w:line="246.99999999999994" w:lineRule="auto"/>
-              <w:rPr/>
+              <w:rPr>
+                <w:sz w:val="21"/>
+                <w:szCs w:val="21"/>
+              </w:rPr>
             </w:pPr>
             <w:r>
               <w:rPr>
@@ -684,8 +726,8 @@
                 <w:i w:val="0"/>
                 <w:iCs w:val="0"/>
                 <w:color w:val="303030"/>
-                <w:sz w:val="18"/>
-                <w:szCs w:val="18"/>
+                <w:sz w:val="20"/>
+                <w:szCs w:val="20"/>
                 <w:rtl w:val="0"/>
               </w:rPr>
               <w:t xml:space="preserve">{{SHIP_TO_PHONE}}  ·  {{SHIP_TO_EMAIL}}</w:t>
@@ -702,7 +744,10 @@
     <w:p>
       <w:pPr>
         <w:spacing w:after="60" w:before="180" w:line="240" w:lineRule="auto"/>
-        <w:rPr/>
+        <w:rPr>
+          <w:sz w:val="21"/>
+          <w:szCs w:val="21"/>
+        </w:rPr>
       </w:pPr>
       <w:r>
         <w:rPr>
@@ -712,8 +757,8 @@
           <w:i w:val="0"/>
           <w:iCs w:val="0"/>
           <w:color w:val="f39a05"/>
-          <w:sz w:val="18"/>
-          <w:szCs w:val="18"/>
+          <w:sz w:val="20"/>
+          <w:szCs w:val="20"/>
           <w:rtl w:val="0"/>
         </w:rPr>
         <w:t xml:space="preserve">COMMENTS / SPECIAL INSTRUCTIONS</w:t>
@@ -727,7 +772,10 @@
     <w:p>
       <w:pPr>
         <w:spacing w:after="180" w:before="0" w:line="240" w:lineRule="auto"/>
-        <w:rPr/>
+        <w:rPr>
+          <w:sz w:val="21"/>
+          <w:szCs w:val="21"/>
+        </w:rPr>
       </w:pPr>
       <w:r>
         <w:rPr>
@@ -737,8 +785,8 @@
           <w:i w:val="0"/>
           <w:iCs w:val="0"/>
           <w:color w:val="303030"/>
-          <w:sz w:val="18"/>
-          <w:szCs w:val="18"/>
+          <w:sz w:val="20"/>
+          <w:szCs w:val="20"/>
           <w:rtl w:val="0"/>
         </w:rPr>
         <w:t xml:space="preserve">{{COMMENTS}}</w:t>
@@ -794,7 +842,10 @@
             <w:pPr>
               <w:spacing w:after="0" w:before="0" w:line="240" w:lineRule="auto"/>
               <w:jc w:val="center"/>
-              <w:rPr/>
+              <w:rPr>
+                <w:sz w:val="21"/>
+                <w:szCs w:val="21"/>
+              </w:rPr>
             </w:pPr>
             <w:r>
               <w:rPr>
@@ -804,8 +855,8 @@
                 <w:i w:val="0"/>
                 <w:iCs w:val="0"/>
                 <w:color w:val="ffffff"/>
-                <w:sz w:val="14"/>
-                <w:szCs w:val="14"/>
+                <w:sz w:val="16"/>
+                <w:szCs w:val="16"/>
                 <w:rtl w:val="0"/>
               </w:rPr>
               <w:t xml:space="preserve">SALESPERSON</w:t>
@@ -833,7 +884,10 @@
             <w:pPr>
               <w:spacing w:after="0" w:before="0" w:line="240" w:lineRule="auto"/>
               <w:jc w:val="center"/>
-              <w:rPr/>
+              <w:rPr>
+                <w:sz w:val="21"/>
+                <w:szCs w:val="21"/>
+              </w:rPr>
             </w:pPr>
             <w:r>
               <w:rPr>
@@ -843,8 +897,8 @@
                 <w:i w:val="0"/>
                 <w:iCs w:val="0"/>
                 <w:color w:val="ffffff"/>
-                <w:sz w:val="14"/>
-                <w:szCs w:val="14"/>
+                <w:sz w:val="16"/>
+                <w:szCs w:val="16"/>
                 <w:rtl w:val="0"/>
               </w:rPr>
               <w:t xml:space="preserve">CUSTOMER PO#</w:t>
@@ -872,7 +926,10 @@
             <w:pPr>
               <w:spacing w:after="0" w:before="0" w:line="240" w:lineRule="auto"/>
               <w:jc w:val="center"/>
-              <w:rPr/>
+              <w:rPr>
+                <w:sz w:val="21"/>
+                <w:szCs w:val="21"/>
+              </w:rPr>
             </w:pPr>
             <w:r>
               <w:rPr>
@@ -882,8 +939,8 @@
                 <w:i w:val="0"/>
                 <w:iCs w:val="0"/>
                 <w:color w:val="ffffff"/>
-                <w:sz w:val="14"/>
-                <w:szCs w:val="14"/>
+                <w:sz w:val="16"/>
+                <w:szCs w:val="16"/>
                 <w:rtl w:val="0"/>
               </w:rPr>
               <w:t xml:space="preserve">TRACKING #</w:t>
@@ -911,7 +968,10 @@
             <w:pPr>
               <w:spacing w:after="0" w:before="0" w:line="240" w:lineRule="auto"/>
               <w:jc w:val="center"/>
-              <w:rPr/>
+              <w:rPr>
+                <w:sz w:val="21"/>
+                <w:szCs w:val="21"/>
+              </w:rPr>
             </w:pPr>
             <w:r>
               <w:rPr>
@@ -921,8 +981,8 @@
                 <w:i w:val="0"/>
                 <w:iCs w:val="0"/>
                 <w:color w:val="ffffff"/>
-                <w:sz w:val="14"/>
-                <w:szCs w:val="14"/>
+                <w:sz w:val="16"/>
+                <w:szCs w:val="16"/>
                 <w:rtl w:val="0"/>
               </w:rPr>
               <w:t xml:space="preserve">SHIPPED VIA</w:t>
@@ -950,7 +1010,10 @@
             <w:pPr>
               <w:spacing w:after="0" w:before="0" w:line="240" w:lineRule="auto"/>
               <w:jc w:val="center"/>
-              <w:rPr/>
+              <w:rPr>
+                <w:sz w:val="21"/>
+                <w:szCs w:val="21"/>
+              </w:rPr>
             </w:pPr>
             <w:r>
               <w:rPr>
@@ -960,8 +1023,8 @@
                 <w:i w:val="0"/>
                 <w:iCs w:val="0"/>
                 <w:color w:val="ffffff"/>
-                <w:sz w:val="14"/>
-                <w:szCs w:val="14"/>
+                <w:sz w:val="16"/>
+                <w:szCs w:val="16"/>
                 <w:rtl w:val="0"/>
               </w:rPr>
               <w:t xml:space="preserve">TERMS</w:t>
@@ -994,7 +1057,10 @@
             <w:pPr>
               <w:spacing w:after="0" w:before="0" w:line="240" w:lineRule="auto"/>
               <w:jc w:val="center"/>
-              <w:rPr/>
+              <w:rPr>
+                <w:sz w:val="21"/>
+                <w:szCs w:val="21"/>
+              </w:rPr>
             </w:pPr>
             <w:r>
               <w:rPr>
@@ -1004,8 +1070,8 @@
                 <w:i w:val="0"/>
                 <w:iCs w:val="0"/>
                 <w:color w:val="303030"/>
-                <w:sz w:val="16"/>
-                <w:szCs w:val="16"/>
+                <w:sz w:val="18"/>
+                <w:szCs w:val="18"/>
                 <w:rtl w:val="0"/>
               </w:rPr>
               <w:t xml:space="preserve">{{SALESPERSON}}</w:t>
@@ -1032,7 +1098,10 @@
             <w:pPr>
               <w:spacing w:after="0" w:before="0" w:line="240" w:lineRule="auto"/>
               <w:jc w:val="center"/>
-              <w:rPr/>
+              <w:rPr>
+                <w:sz w:val="21"/>
+                <w:szCs w:val="21"/>
+              </w:rPr>
             </w:pPr>
             <w:r>
               <w:rPr>
@@ -1042,8 +1111,8 @@
                 <w:i w:val="0"/>
                 <w:iCs w:val="0"/>
                 <w:color w:val="303030"/>
-                <w:sz w:val="16"/>
-                <w:szCs w:val="16"/>
+                <w:sz w:val="18"/>
+                <w:szCs w:val="18"/>
                 <w:rtl w:val="0"/>
               </w:rPr>
               <w:t xml:space="preserve">{{CUSTOMER_PO}}</w:t>
@@ -1070,7 +1139,10 @@
             <w:pPr>
               <w:spacing w:after="0" w:before="0" w:line="240" w:lineRule="auto"/>
               <w:jc w:val="center"/>
-              <w:rPr/>
+              <w:rPr>
+                <w:sz w:val="21"/>
+                <w:szCs w:val="21"/>
+              </w:rPr>
             </w:pPr>
             <w:r>
               <w:rPr>
@@ -1080,8 +1152,8 @@
                 <w:i w:val="0"/>
                 <w:iCs w:val="0"/>
                 <w:color w:val="303030"/>
-                <w:sz w:val="16"/>
-                <w:szCs w:val="16"/>
+                <w:sz w:val="18"/>
+                <w:szCs w:val="18"/>
                 <w:rtl w:val="0"/>
               </w:rPr>
               <w:t xml:space="preserve">{{TRACKING_NUMBER}}</w:t>
@@ -1108,7 +1180,10 @@
             <w:pPr>
               <w:spacing w:after="0" w:before="0" w:line="240" w:lineRule="auto"/>
               <w:jc w:val="center"/>
-              <w:rPr/>
+              <w:rPr>
+                <w:sz w:val="21"/>
+                <w:szCs w:val="21"/>
+              </w:rPr>
             </w:pPr>
             <w:r>
               <w:rPr>
@@ -1118,8 +1193,8 @@
                 <w:i w:val="0"/>
                 <w:iCs w:val="0"/>
                 <w:color w:val="303030"/>
-                <w:sz w:val="16"/>
-                <w:szCs w:val="16"/>
+                <w:sz w:val="18"/>
+                <w:szCs w:val="18"/>
                 <w:rtl w:val="0"/>
               </w:rPr>
               <w:t xml:space="preserve">{{SHIPPED_VIA}}</w:t>
@@ -1146,7 +1221,10 @@
             <w:pPr>
               <w:spacing w:after="0" w:before="0" w:line="240" w:lineRule="auto"/>
               <w:jc w:val="center"/>
-              <w:rPr/>
+              <w:rPr>
+                <w:sz w:val="21"/>
+                <w:szCs w:val="21"/>
+              </w:rPr>
             </w:pPr>
             <w:r>
               <w:rPr>
@@ -1156,8 +1234,8 @@
                 <w:i w:val="0"/>
                 <w:iCs w:val="0"/>
                 <w:color w:val="303030"/>
-                <w:sz w:val="16"/>
-                <w:szCs w:val="16"/>
+                <w:sz w:val="18"/>
+                <w:szCs w:val="18"/>
                 <w:rtl w:val="0"/>
               </w:rPr>
               <w:t xml:space="preserve">{{PAYMENT_TERMS}}</w:t>
@@ -1174,7 +1252,10 @@
     <w:p>
       <w:pPr>
         <w:spacing w:after="100" w:lineRule="auto"/>
-        <w:rPr/>
+        <w:rPr>
+          <w:sz w:val="21"/>
+          <w:szCs w:val="21"/>
+        </w:rPr>
       </w:pPr>
       <w:r>
         <w:rPr>
@@ -1223,7 +1304,10 @@
             <w:pPr>
               <w:spacing w:after="0" w:before="0" w:line="240" w:lineRule="auto"/>
               <w:jc w:val="center"/>
-              <w:rPr/>
+              <w:rPr>
+                <w:sz w:val="21"/>
+                <w:szCs w:val="21"/>
+              </w:rPr>
             </w:pPr>
             <w:r>
               <w:rPr>
@@ -1233,8 +1317,8 @@
                 <w:i w:val="0"/>
                 <w:iCs w:val="0"/>
                 <w:color w:val="ffffff"/>
-                <w:sz w:val="16"/>
-                <w:szCs w:val="16"/>
+                <w:sz w:val="18"/>
+                <w:szCs w:val="18"/>
                 <w:rtl w:val="0"/>
               </w:rPr>
               <w:t xml:space="preserve">#</w:t>
@@ -1258,7 +1342,10 @@
             <w:pPr>
               <w:spacing w:after="0" w:before="0" w:line="240" w:lineRule="auto"/>
               <w:jc w:val="center"/>
-              <w:rPr/>
+              <w:rPr>
+                <w:sz w:val="21"/>
+                <w:szCs w:val="21"/>
+              </w:rPr>
             </w:pPr>
             <w:r>
               <w:rPr>
@@ -1268,8 +1355,8 @@
                 <w:i w:val="0"/>
                 <w:iCs w:val="0"/>
                 <w:color w:val="ffffff"/>
-                <w:sz w:val="16"/>
-                <w:szCs w:val="16"/>
+                <w:sz w:val="18"/>
+                <w:szCs w:val="18"/>
                 <w:rtl w:val="0"/>
               </w:rPr>
               <w:t xml:space="preserve">QTY</w:t>
@@ -1293,7 +1380,10 @@
             <w:pPr>
               <w:spacing w:after="0" w:before="0" w:line="240" w:lineRule="auto"/>
               <w:jc w:val="center"/>
-              <w:rPr/>
+              <w:rPr>
+                <w:sz w:val="21"/>
+                <w:szCs w:val="21"/>
+              </w:rPr>
             </w:pPr>
             <w:r>
               <w:rPr>
@@ -1303,8 +1393,8 @@
                 <w:i w:val="0"/>
                 <w:iCs w:val="0"/>
                 <w:color w:val="ffffff"/>
-                <w:sz w:val="16"/>
-                <w:szCs w:val="16"/>
+                <w:sz w:val="18"/>
+                <w:szCs w:val="18"/>
                 <w:rtl w:val="0"/>
               </w:rPr>
               <w:t xml:space="preserve">DESCRIPTION</w:t>
@@ -1328,7 +1418,10 @@
             <w:pPr>
               <w:spacing w:after="0" w:before="0" w:line="240" w:lineRule="auto"/>
               <w:jc w:val="center"/>
-              <w:rPr/>
+              <w:rPr>
+                <w:sz w:val="21"/>
+                <w:szCs w:val="21"/>
+              </w:rPr>
             </w:pPr>
             <w:r>
               <w:rPr>
@@ -1338,8 +1431,8 @@
                 <w:i w:val="0"/>
                 <w:iCs w:val="0"/>
                 <w:color w:val="ffffff"/>
-                <w:sz w:val="16"/>
-                <w:szCs w:val="16"/>
+                <w:sz w:val="18"/>
+                <w:szCs w:val="18"/>
                 <w:rtl w:val="0"/>
               </w:rPr>
               <w:t xml:space="preserve">UNIT PRICE</w:t>
@@ -1363,7 +1456,10 @@
             <w:pPr>
               <w:spacing w:after="0" w:before="0" w:line="240" w:lineRule="auto"/>
               <w:jc w:val="center"/>
-              <w:rPr/>
+              <w:rPr>
+                <w:sz w:val="21"/>
+                <w:szCs w:val="21"/>
+              </w:rPr>
             </w:pPr>
             <w:r>
               <w:rPr>
@@ -1373,8 +1469,8 @@
                 <w:i w:val="0"/>
                 <w:iCs w:val="0"/>
                 <w:color w:val="ffffff"/>
-                <w:sz w:val="16"/>
-                <w:szCs w:val="16"/>
+                <w:sz w:val="18"/>
+                <w:szCs w:val="18"/>
                 <w:rtl w:val="0"/>
               </w:rPr>
               <w:t xml:space="preserve">AMOUNT</w:t>
@@ -1407,7 +1503,10 @@
             <w:pPr>
               <w:spacing w:after="0" w:before="0" w:line="240" w:lineRule="auto"/>
               <w:jc w:val="center"/>
-              <w:rPr/>
+              <w:rPr>
+                <w:sz w:val="21"/>
+                <w:szCs w:val="21"/>
+              </w:rPr>
             </w:pPr>
             <w:r>
               <w:rPr>
@@ -1417,8 +1516,8 @@
                 <w:i w:val="0"/>
                 <w:iCs w:val="0"/>
                 <w:color w:val="303030"/>
-                <w:sz w:val="16"/>
-                <w:szCs w:val="16"/>
+                <w:sz w:val="18"/>
+                <w:szCs w:val="18"/>
                 <w:rtl w:val="0"/>
               </w:rPr>
               <w:t xml:space="preserve">1</w:t>
@@ -1445,7 +1544,10 @@
             <w:pPr>
               <w:spacing w:after="0" w:before="0" w:line="240" w:lineRule="auto"/>
               <w:jc w:val="right"/>
-              <w:rPr/>
+              <w:rPr>
+                <w:sz w:val="21"/>
+                <w:szCs w:val="21"/>
+              </w:rPr>
             </w:pPr>
             <w:r>
               <w:rPr>
@@ -1455,8 +1557,8 @@
                 <w:i w:val="0"/>
                 <w:iCs w:val="0"/>
                 <w:color w:val="303030"/>
-                <w:sz w:val="16"/>
-                <w:szCs w:val="16"/>
+                <w:sz w:val="18"/>
+                <w:szCs w:val="18"/>
                 <w:rtl w:val="0"/>
               </w:rPr>
               <w:t xml:space="preserve">{{QTY1}}</w:t>
@@ -1483,7 +1585,10 @@
             <w:pPr>
               <w:spacing w:after="0" w:before="0" w:line="240" w:lineRule="auto"/>
               <w:jc w:val="left"/>
-              <w:rPr/>
+              <w:rPr>
+                <w:sz w:val="21"/>
+                <w:szCs w:val="21"/>
+              </w:rPr>
             </w:pPr>
             <w:r>
               <w:rPr>
@@ -1493,8 +1598,8 @@
                 <w:i w:val="0"/>
                 <w:iCs w:val="0"/>
                 <w:color w:val="303030"/>
-                <w:sz w:val="16"/>
-                <w:szCs w:val="16"/>
+                <w:sz w:val="18"/>
+                <w:szCs w:val="18"/>
                 <w:rtl w:val="0"/>
               </w:rPr>
               <w:t xml:space="preserve">{{DESC1}}</w:t>
@@ -1521,7 +1626,10 @@
             <w:pPr>
               <w:spacing w:after="0" w:before="0" w:line="240" w:lineRule="auto"/>
               <w:jc w:val="right"/>
-              <w:rPr/>
+              <w:rPr>
+                <w:sz w:val="21"/>
+                <w:szCs w:val="21"/>
+              </w:rPr>
             </w:pPr>
             <w:r>
               <w:rPr>
@@ -1531,8 +1639,8 @@
                 <w:i w:val="0"/>
                 <w:iCs w:val="0"/>
                 <w:color w:val="303030"/>
-                <w:sz w:val="16"/>
-                <w:szCs w:val="16"/>
+                <w:sz w:val="18"/>
+                <w:szCs w:val="18"/>
                 <w:rtl w:val="0"/>
               </w:rPr>
               <w:t xml:space="preserve">{{PRICE1}}</w:t>
@@ -1559,7 +1667,10 @@
             <w:pPr>
               <w:spacing w:after="0" w:before="0" w:line="240" w:lineRule="auto"/>
               <w:jc w:val="right"/>
-              <w:rPr/>
+              <w:rPr>
+                <w:sz w:val="21"/>
+                <w:szCs w:val="21"/>
+              </w:rPr>
             </w:pPr>
             <w:r>
               <w:rPr>
@@ -1569,8 +1680,8 @@
                 <w:i w:val="0"/>
                 <w:iCs w:val="0"/>
                 <w:color w:val="303030"/>
-                <w:sz w:val="16"/>
-                <w:szCs w:val="16"/>
+                <w:sz w:val="18"/>
+                <w:szCs w:val="18"/>
                 <w:rtl w:val="0"/>
               </w:rPr>
               <w:t xml:space="preserve">{{AMOUNT1}}</w:t>
@@ -1603,7 +1714,10 @@
             <w:pPr>
               <w:spacing w:after="0" w:before="0" w:line="240" w:lineRule="auto"/>
               <w:jc w:val="center"/>
-              <w:rPr/>
+              <w:rPr>
+                <w:sz w:val="21"/>
+                <w:szCs w:val="21"/>
+              </w:rPr>
             </w:pPr>
             <w:r>
               <w:rPr>
@@ -1613,8 +1727,8 @@
                 <w:i w:val="0"/>
                 <w:iCs w:val="0"/>
                 <w:color w:val="303030"/>
-                <w:sz w:val="16"/>
-                <w:szCs w:val="16"/>
+                <w:sz w:val="18"/>
+                <w:szCs w:val="18"/>
                 <w:rtl w:val="0"/>
               </w:rPr>
               <w:t xml:space="preserve">2</w:t>
@@ -1641,7 +1755,10 @@
             <w:pPr>
               <w:spacing w:after="0" w:before="0" w:line="240" w:lineRule="auto"/>
               <w:jc w:val="right"/>
-              <w:rPr/>
+              <w:rPr>
+                <w:sz w:val="21"/>
+                <w:szCs w:val="21"/>
+              </w:rPr>
             </w:pPr>
             <w:r>
               <w:rPr>
@@ -1651,8 +1768,8 @@
                 <w:i w:val="0"/>
                 <w:iCs w:val="0"/>
                 <w:color w:val="303030"/>
-                <w:sz w:val="16"/>
-                <w:szCs w:val="16"/>
+                <w:sz w:val="18"/>
+                <w:szCs w:val="18"/>
                 <w:rtl w:val="0"/>
               </w:rPr>
               <w:t xml:space="preserve">{{QTY2}}</w:t>
@@ -1679,7 +1796,10 @@
             <w:pPr>
               <w:spacing w:after="0" w:before="0" w:line="240" w:lineRule="auto"/>
               <w:jc w:val="left"/>
-              <w:rPr/>
+              <w:rPr>
+                <w:sz w:val="21"/>
+                <w:szCs w:val="21"/>
+              </w:rPr>
             </w:pPr>
             <w:r>
               <w:rPr>
@@ -1689,8 +1809,8 @@
                 <w:i w:val="0"/>
                 <w:iCs w:val="0"/>
                 <w:color w:val="303030"/>
-                <w:sz w:val="16"/>
-                <w:szCs w:val="16"/>
+                <w:sz w:val="18"/>
+                <w:szCs w:val="18"/>
                 <w:rtl w:val="0"/>
               </w:rPr>
               <w:t xml:space="preserve">{{DESC2}}</w:t>
@@ -1717,7 +1837,10 @@
             <w:pPr>
               <w:spacing w:after="0" w:before="0" w:line="240" w:lineRule="auto"/>
               <w:jc w:val="right"/>
-              <w:rPr/>
+              <w:rPr>
+                <w:sz w:val="21"/>
+                <w:szCs w:val="21"/>
+              </w:rPr>
             </w:pPr>
             <w:r>
               <w:rPr>
@@ -1727,8 +1850,8 @@
                 <w:i w:val="0"/>
                 <w:iCs w:val="0"/>
                 <w:color w:val="303030"/>
-                <w:sz w:val="16"/>
-                <w:szCs w:val="16"/>
+                <w:sz w:val="18"/>
+                <w:szCs w:val="18"/>
                 <w:rtl w:val="0"/>
               </w:rPr>
               <w:t xml:space="preserve">{{PRICE2}}</w:t>
@@ -1755,7 +1878,10 @@
             <w:pPr>
               <w:spacing w:after="0" w:before="0" w:line="240" w:lineRule="auto"/>
               <w:jc w:val="right"/>
-              <w:rPr/>
+              <w:rPr>
+                <w:sz w:val="21"/>
+                <w:szCs w:val="21"/>
+              </w:rPr>
             </w:pPr>
             <w:r>
               <w:rPr>
@@ -1765,8 +1891,8 @@
                 <w:i w:val="0"/>
                 <w:iCs w:val="0"/>
                 <w:color w:val="303030"/>
-                <w:sz w:val="16"/>
-                <w:szCs w:val="16"/>
+                <w:sz w:val="18"/>
+                <w:szCs w:val="18"/>
                 <w:rtl w:val="0"/>
               </w:rPr>
               <w:t xml:space="preserve">{{AMOUNT2}}</w:t>
@@ -1799,7 +1925,10 @@
             <w:pPr>
               <w:spacing w:after="0" w:before="0" w:line="240" w:lineRule="auto"/>
               <w:jc w:val="center"/>
-              <w:rPr/>
+              <w:rPr>
+                <w:sz w:val="21"/>
+                <w:szCs w:val="21"/>
+              </w:rPr>
             </w:pPr>
             <w:r>
               <w:rPr>
@@ -1809,8 +1938,8 @@
                 <w:i w:val="0"/>
                 <w:iCs w:val="0"/>
                 <w:color w:val="666666"/>
-                <w:sz w:val="16"/>
-                <w:szCs w:val="16"/>
+                <w:sz w:val="18"/>
+                <w:szCs w:val="18"/>
                 <w:rtl w:val="0"/>
               </w:rPr>
               <w:t xml:space="preserve">3</w:t>
@@ -1837,7 +1966,10 @@
             <w:pPr>
               <w:spacing w:after="0" w:before="0" w:line="240" w:lineRule="auto"/>
               <w:jc w:val="right"/>
-              <w:rPr/>
+              <w:rPr>
+                <w:sz w:val="21"/>
+                <w:szCs w:val="21"/>
+              </w:rPr>
             </w:pPr>
             <w:r>
               <w:rPr>
@@ -1847,8 +1979,8 @@
                 <w:i w:val="0"/>
                 <w:iCs w:val="0"/>
                 <w:color w:val="666666"/>
-                <w:sz w:val="16"/>
-                <w:szCs w:val="16"/>
+                <w:sz w:val="18"/>
+                <w:szCs w:val="18"/>
                 <w:rtl w:val="0"/>
               </w:rPr>
               <w:t xml:space="preserve">{{QTY3}}</w:t>
@@ -1875,7 +2007,10 @@
             <w:pPr>
               <w:spacing w:after="0" w:before="0" w:line="240" w:lineRule="auto"/>
               <w:jc w:val="left"/>
-              <w:rPr/>
+              <w:rPr>
+                <w:sz w:val="21"/>
+                <w:szCs w:val="21"/>
+              </w:rPr>
             </w:pPr>
             <w:r>
               <w:rPr>
@@ -1885,8 +2020,8 @@
                 <w:i w:val="0"/>
                 <w:iCs w:val="0"/>
                 <w:color w:val="666666"/>
-                <w:sz w:val="16"/>
-                <w:szCs w:val="16"/>
+                <w:sz w:val="18"/>
+                <w:szCs w:val="18"/>
                 <w:rtl w:val="0"/>
               </w:rPr>
               <w:t xml:space="preserve">{{DESC3}}</w:t>
@@ -1913,7 +2048,10 @@
             <w:pPr>
               <w:spacing w:after="0" w:before="0" w:line="240" w:lineRule="auto"/>
               <w:jc w:val="right"/>
-              <w:rPr/>
+              <w:rPr>
+                <w:sz w:val="21"/>
+                <w:szCs w:val="21"/>
+              </w:rPr>
             </w:pPr>
             <w:r>
               <w:rPr>
@@ -1923,8 +2061,8 @@
                 <w:i w:val="0"/>
                 <w:iCs w:val="0"/>
                 <w:color w:val="666666"/>
-                <w:sz w:val="16"/>
-                <w:szCs w:val="16"/>
+                <w:sz w:val="18"/>
+                <w:szCs w:val="18"/>
                 <w:rtl w:val="0"/>
               </w:rPr>
               <w:t xml:space="preserve">{{PRICE3}}</w:t>
@@ -1951,7 +2089,10 @@
             <w:pPr>
               <w:spacing w:after="0" w:before="0" w:line="240" w:lineRule="auto"/>
               <w:jc w:val="right"/>
-              <w:rPr/>
+              <w:rPr>
+                <w:sz w:val="21"/>
+                <w:szCs w:val="21"/>
+              </w:rPr>
             </w:pPr>
             <w:r>
               <w:rPr>
@@ -1961,8 +2102,8 @@
                 <w:i w:val="0"/>
                 <w:iCs w:val="0"/>
                 <w:color w:val="666666"/>
-                <w:sz w:val="16"/>
-                <w:szCs w:val="16"/>
+                <w:sz w:val="18"/>
+                <w:szCs w:val="18"/>
                 <w:rtl w:val="0"/>
               </w:rPr>
               <w:t xml:space="preserve">{{AMOUNT3}}</w:t>
@@ -1995,7 +2136,10 @@
             <w:pPr>
               <w:spacing w:after="0" w:before="0" w:line="240" w:lineRule="auto"/>
               <w:jc w:val="center"/>
-              <w:rPr/>
+              <w:rPr>
+                <w:sz w:val="21"/>
+                <w:szCs w:val="21"/>
+              </w:rPr>
             </w:pPr>
             <w:r>
               <w:rPr>
@@ -2005,8 +2149,8 @@
                 <w:i w:val="0"/>
                 <w:iCs w:val="0"/>
                 <w:color w:val="666666"/>
-                <w:sz w:val="16"/>
-                <w:szCs w:val="16"/>
+                <w:sz w:val="18"/>
+                <w:szCs w:val="18"/>
                 <w:rtl w:val="0"/>
               </w:rPr>
               <w:t xml:space="preserve">4</w:t>
@@ -2033,7 +2177,10 @@
             <w:pPr>
               <w:spacing w:after="0" w:before="0" w:line="240" w:lineRule="auto"/>
               <w:jc w:val="right"/>
-              <w:rPr/>
+              <w:rPr>
+                <w:sz w:val="21"/>
+                <w:szCs w:val="21"/>
+              </w:rPr>
             </w:pPr>
             <w:r>
               <w:rPr>
@@ -2043,8 +2190,8 @@
                 <w:i w:val="0"/>
                 <w:iCs w:val="0"/>
                 <w:color w:val="666666"/>
-                <w:sz w:val="16"/>
-                <w:szCs w:val="16"/>
+                <w:sz w:val="18"/>
+                <w:szCs w:val="18"/>
                 <w:rtl w:val="0"/>
               </w:rPr>
               <w:t xml:space="preserve">{{QTY4}}</w:t>
@@ -2071,7 +2218,10 @@
             <w:pPr>
               <w:spacing w:after="0" w:before="0" w:line="240" w:lineRule="auto"/>
               <w:jc w:val="left"/>
-              <w:rPr/>
+              <w:rPr>
+                <w:sz w:val="21"/>
+                <w:szCs w:val="21"/>
+              </w:rPr>
             </w:pPr>
             <w:r>
               <w:rPr>
@@ -2081,8 +2231,8 @@
                 <w:i w:val="0"/>
                 <w:iCs w:val="0"/>
                 <w:color w:val="666666"/>
-                <w:sz w:val="16"/>
-                <w:szCs w:val="16"/>
+                <w:sz w:val="18"/>
+                <w:szCs w:val="18"/>
                 <w:rtl w:val="0"/>
               </w:rPr>
               <w:t xml:space="preserve">{{DESC4}}</w:t>
@@ -2109,7 +2259,10 @@
             <w:pPr>
               <w:spacing w:after="0" w:before="0" w:line="240" w:lineRule="auto"/>
               <w:jc w:val="right"/>
-              <w:rPr/>
+              <w:rPr>
+                <w:sz w:val="21"/>
+                <w:szCs w:val="21"/>
+              </w:rPr>
             </w:pPr>
             <w:r>
               <w:rPr>
@@ -2119,8 +2272,8 @@
                 <w:i w:val="0"/>
                 <w:iCs w:val="0"/>
                 <w:color w:val="666666"/>
-                <w:sz w:val="16"/>
-                <w:szCs w:val="16"/>
+                <w:sz w:val="18"/>
+                <w:szCs w:val="18"/>
                 <w:rtl w:val="0"/>
               </w:rPr>
               <w:t xml:space="preserve">{{PRICE4}}</w:t>
@@ -2147,7 +2300,10 @@
             <w:pPr>
               <w:spacing w:after="0" w:before="0" w:line="240" w:lineRule="auto"/>
               <w:jc w:val="right"/>
-              <w:rPr/>
+              <w:rPr>
+                <w:sz w:val="21"/>
+                <w:szCs w:val="21"/>
+              </w:rPr>
             </w:pPr>
             <w:r>
               <w:rPr>
@@ -2157,8 +2313,8 @@
                 <w:i w:val="0"/>
                 <w:iCs w:val="0"/>
                 <w:color w:val="666666"/>
-                <w:sz w:val="16"/>
-                <w:szCs w:val="16"/>
+                <w:sz w:val="18"/>
+                <w:szCs w:val="18"/>
                 <w:rtl w:val="0"/>
               </w:rPr>
               <w:t xml:space="preserve">{{AMOUNT4}}</w:t>
@@ -2191,7 +2347,10 @@
             <w:pPr>
               <w:spacing w:after="0" w:before="0" w:line="240" w:lineRule="auto"/>
               <w:jc w:val="center"/>
-              <w:rPr/>
+              <w:rPr>
+                <w:sz w:val="21"/>
+                <w:szCs w:val="21"/>
+              </w:rPr>
             </w:pPr>
             <w:r>
               <w:rPr>
@@ -2201,8 +2360,8 @@
                 <w:i w:val="0"/>
                 <w:iCs w:val="0"/>
                 <w:color w:val="666666"/>
-                <w:sz w:val="16"/>
-                <w:szCs w:val="16"/>
+                <w:sz w:val="18"/>
+                <w:szCs w:val="18"/>
                 <w:rtl w:val="0"/>
               </w:rPr>
               <w:t xml:space="preserve">5</w:t>
@@ -2229,7 +2388,10 @@
             <w:pPr>
               <w:spacing w:after="0" w:before="0" w:line="240" w:lineRule="auto"/>
               <w:jc w:val="right"/>
-              <w:rPr/>
+              <w:rPr>
+                <w:sz w:val="21"/>
+                <w:szCs w:val="21"/>
+              </w:rPr>
             </w:pPr>
             <w:r>
               <w:rPr>
@@ -2239,8 +2401,8 @@
                 <w:i w:val="0"/>
                 <w:iCs w:val="0"/>
                 <w:color w:val="666666"/>
-                <w:sz w:val="16"/>
-                <w:szCs w:val="16"/>
+                <w:sz w:val="18"/>
+                <w:szCs w:val="18"/>
                 <w:rtl w:val="0"/>
               </w:rPr>
               <w:t xml:space="preserve">{{QTY5}}</w:t>
@@ -2267,7 +2429,10 @@
             <w:pPr>
               <w:spacing w:after="0" w:before="0" w:line="240" w:lineRule="auto"/>
               <w:jc w:val="left"/>
-              <w:rPr/>
+              <w:rPr>
+                <w:sz w:val="21"/>
+                <w:szCs w:val="21"/>
+              </w:rPr>
             </w:pPr>
             <w:r>
               <w:rPr>
@@ -2277,8 +2442,8 @@
                 <w:i w:val="0"/>
                 <w:iCs w:val="0"/>
                 <w:color w:val="666666"/>
-                <w:sz w:val="16"/>
-                <w:szCs w:val="16"/>
+                <w:sz w:val="18"/>
+                <w:szCs w:val="18"/>
                 <w:rtl w:val="0"/>
               </w:rPr>
               <w:t xml:space="preserve">{{DESC5}}</w:t>
@@ -2305,7 +2470,10 @@
             <w:pPr>
               <w:spacing w:after="0" w:before="0" w:line="240" w:lineRule="auto"/>
               <w:jc w:val="right"/>
-              <w:rPr/>
+              <w:rPr>
+                <w:sz w:val="21"/>
+                <w:szCs w:val="21"/>
+              </w:rPr>
             </w:pPr>
             <w:r>
               <w:rPr>
@@ -2315,8 +2483,8 @@
                 <w:i w:val="0"/>
                 <w:iCs w:val="0"/>
                 <w:color w:val="666666"/>
-                <w:sz w:val="16"/>
-                <w:szCs w:val="16"/>
+                <w:sz w:val="18"/>
+                <w:szCs w:val="18"/>
                 <w:rtl w:val="0"/>
               </w:rPr>
               <w:t xml:space="preserve">{{PRICE5}}</w:t>
@@ -2343,7 +2511,10 @@
             <w:pPr>
               <w:spacing w:after="0" w:before="0" w:line="240" w:lineRule="auto"/>
               <w:jc w:val="right"/>
-              <w:rPr/>
+              <w:rPr>
+                <w:sz w:val="21"/>
+                <w:szCs w:val="21"/>
+              </w:rPr>
             </w:pPr>
             <w:r>
               <w:rPr>
@@ -2353,8 +2524,8 @@
                 <w:i w:val="0"/>
                 <w:iCs w:val="0"/>
                 <w:color w:val="666666"/>
-                <w:sz w:val="16"/>
-                <w:szCs w:val="16"/>
+                <w:sz w:val="18"/>
+                <w:szCs w:val="18"/>
                 <w:rtl w:val="0"/>
               </w:rPr>
               <w:t xml:space="preserve">{{AMOUNT5}}</w:t>
@@ -2387,7 +2558,10 @@
             <w:pPr>
               <w:spacing w:after="0" w:before="0" w:line="240" w:lineRule="auto"/>
               <w:jc w:val="center"/>
-              <w:rPr/>
+              <w:rPr>
+                <w:sz w:val="21"/>
+                <w:szCs w:val="21"/>
+              </w:rPr>
             </w:pPr>
             <w:r>
               <w:rPr>
@@ -2397,8 +2571,8 @@
                 <w:i w:val="0"/>
                 <w:iCs w:val="0"/>
                 <w:color w:val="666666"/>
-                <w:sz w:val="16"/>
-                <w:szCs w:val="16"/>
+                <w:sz w:val="18"/>
+                <w:szCs w:val="18"/>
                 <w:rtl w:val="0"/>
               </w:rPr>
               <w:t xml:space="preserve">6</w:t>
@@ -2425,7 +2599,10 @@
             <w:pPr>
               <w:spacing w:after="0" w:before="0" w:line="240" w:lineRule="auto"/>
               <w:jc w:val="right"/>
-              <w:rPr/>
+              <w:rPr>
+                <w:sz w:val="21"/>
+                <w:szCs w:val="21"/>
+              </w:rPr>
             </w:pPr>
             <w:r>
               <w:rPr>
@@ -2435,8 +2612,8 @@
                 <w:i w:val="0"/>
                 <w:iCs w:val="0"/>
                 <w:color w:val="666666"/>
-                <w:sz w:val="16"/>
-                <w:szCs w:val="16"/>
+                <w:sz w:val="18"/>
+                <w:szCs w:val="18"/>
                 <w:rtl w:val="0"/>
               </w:rPr>
               <w:t xml:space="preserve">{{QTY6}}</w:t>
@@ -2463,7 +2640,10 @@
             <w:pPr>
               <w:spacing w:after="0" w:before="0" w:line="240" w:lineRule="auto"/>
               <w:jc w:val="left"/>
-              <w:rPr/>
+              <w:rPr>
+                <w:sz w:val="21"/>
+                <w:szCs w:val="21"/>
+              </w:rPr>
             </w:pPr>
             <w:r>
               <w:rPr>
@@ -2473,8 +2653,8 @@
                 <w:i w:val="0"/>
                 <w:iCs w:val="0"/>
                 <w:color w:val="666666"/>
-                <w:sz w:val="16"/>
-                <w:szCs w:val="16"/>
+                <w:sz w:val="18"/>
+                <w:szCs w:val="18"/>
                 <w:rtl w:val="0"/>
               </w:rPr>
               <w:t xml:space="preserve">{{DESC6}}</w:t>
@@ -2501,7 +2681,10 @@
             <w:pPr>
               <w:spacing w:after="0" w:before="0" w:line="240" w:lineRule="auto"/>
               <w:jc w:val="right"/>
-              <w:rPr/>
+              <w:rPr>
+                <w:sz w:val="21"/>
+                <w:szCs w:val="21"/>
+              </w:rPr>
             </w:pPr>
             <w:r>
               <w:rPr>
@@ -2511,8 +2694,8 @@
                 <w:i w:val="0"/>
                 <w:iCs w:val="0"/>
                 <w:color w:val="666666"/>
-                <w:sz w:val="16"/>
-                <w:szCs w:val="16"/>
+                <w:sz w:val="18"/>
+                <w:szCs w:val="18"/>
                 <w:rtl w:val="0"/>
               </w:rPr>
               <w:t xml:space="preserve">{{PRICE6}}</w:t>
@@ -2539,7 +2722,10 @@
             <w:pPr>
               <w:spacing w:after="0" w:before="0" w:line="240" w:lineRule="auto"/>
               <w:jc w:val="right"/>
-              <w:rPr/>
+              <w:rPr>
+                <w:sz w:val="21"/>
+                <w:szCs w:val="21"/>
+              </w:rPr>
             </w:pPr>
             <w:r>
               <w:rPr>
@@ -2549,8 +2735,8 @@
                 <w:i w:val="0"/>
                 <w:iCs w:val="0"/>
                 <w:color w:val="666666"/>
-                <w:sz w:val="16"/>
-                <w:szCs w:val="16"/>
+                <w:sz w:val="18"/>
+                <w:szCs w:val="18"/>
                 <w:rtl w:val="0"/>
               </w:rPr>
               <w:t xml:space="preserve">{{AMOUNT6}}</w:t>
@@ -2567,7 +2753,10 @@
     <w:p>
       <w:pPr>
         <w:spacing w:after="40" w:before="100" w:line="240" w:lineRule="auto"/>
-        <w:rPr/>
+        <w:rPr>
+          <w:sz w:val="21"/>
+          <w:szCs w:val="21"/>
+        </w:rPr>
       </w:pPr>
       <w:r>
         <w:rPr>
@@ -2577,8 +2766,8 @@
           <w:i w:val="0"/>
           <w:iCs w:val="0"/>
           <w:color w:val="42ad3a"/>
-          <w:sz w:val="18"/>
-          <w:szCs w:val="18"/>
+          <w:sz w:val="20"/>
+          <w:szCs w:val="20"/>
           <w:rtl w:val="0"/>
         </w:rPr>
         <w:t xml:space="preserve">PAYMENT DETAILS</w:t>
@@ -2592,7 +2781,10 @@
     <w:p>
       <w:pPr>
         <w:spacing w:after="20" w:before="0" w:line="240" w:lineRule="auto"/>
-        <w:rPr/>
+        <w:rPr>
+          <w:sz w:val="21"/>
+          <w:szCs w:val="21"/>
+        </w:rPr>
       </w:pPr>
       <w:r>
         <w:rPr>
@@ -2602,8 +2794,8 @@
           <w:i w:val="0"/>
           <w:iCs w:val="0"/>
           <w:color w:val="666666"/>
-          <w:sz w:val="16"/>
-          <w:szCs w:val="16"/>
+          <w:sz w:val="18"/>
+          <w:szCs w:val="18"/>
           <w:rtl w:val="0"/>
         </w:rPr>
         <w:t xml:space="preserve">Payment method:  </w:t>
@@ -2616,11 +2808,34 @@
           <w:i w:val="0"/>
           <w:iCs w:val="0"/>
           <w:color w:val="303030"/>
-          <w:sz w:val="16"/>
-          <w:szCs w:val="16"/>
+          <w:sz w:val="18"/>
+          <w:szCs w:val="18"/>
           <w:rtl w:val="0"/>
         </w:rPr>
-        <w:t xml:space="preserve">{{PAYMENT_METHOD}}</w:t>
+        <w:t xml:space="preserve">{{</w:t>
+      </w:r>
+      <w:r>
+        <w:rPr>
+          <w:color w:val="303030"/>
+          <w:sz w:val="18"/>
+          <w:szCs w:val="18"/>
+          <w:rtl w:val="0"/>
+        </w:rPr>
+        <w:t xml:space="preserve">PAYMENT_METHOD</w:t>
+      </w:r>
+      <w:r>
+        <w:rPr>
+          <w:rFonts w:ascii="Trebuchet MS" w:cs="Trebuchet MS" w:eastAsia="Trebuchet MS" w:hAnsi="Trebuchet MS"/>
+          <w:b w:val="0"/>
+          <w:bCs w:val="0"/>
+          <w:i w:val="0"/>
+          <w:iCs w:val="0"/>
+          <w:color w:val="303030"/>
+          <w:sz w:val="18"/>
+          <w:szCs w:val="18"/>
+          <w:rtl w:val="0"/>
+        </w:rPr>
+        <w:t xml:space="preserve">}}</w:t>
       </w:r>
       <w:r>
         <w:rPr>
@@ -2631,8 +2846,322 @@
     <w:p>
       <w:pPr>
         <w:spacing w:after="100" w:before="60" w:line="240" w:lineRule="auto"/>
-        <w:rPr/>
+        <w:rPr>
+          <w:b w:val="1"/>
+          <w:bCs w:val="1"/>
+          <w:i w:val="1"/>
+          <w:iCs w:val="1"/>
+          <w:color w:val="f39a05"/>
+          <w:sz w:val="23"/>
+          <w:szCs w:val="23"/>
+        </w:rPr>
       </w:pPr>
+      <w:r>
+        <w:rPr>
+          <w:b w:val="1"/>
+          <w:bCs w:val="1"/>
+          <w:i w:val="1"/>
+          <w:iCs w:val="1"/>
+          <w:color w:val="f39a05"/>
+          <w:sz w:val="23"/>
+          <w:szCs w:val="23"/>
+        </w:rPr>
+        <mc:AlternateContent>
+          <mc:Choice Requires="wpg">
+            <w:drawing>
+              <wp:anchor allowOverlap="1" behindDoc="1" distB="114300" distT="114300" distL="114300" distR="114300" hidden="0" layoutInCell="1" locked="0" relativeHeight="0" simplePos="0">
+                <wp:simplePos x="0" y="0"/>
+                <wp:positionH relativeFrom="page">
+                  <wp:posOffset>621665</wp:posOffset>
+                </wp:positionH>
+                <wp:positionV relativeFrom="page">
+                  <wp:posOffset>8477250</wp:posOffset>
+                </wp:positionV>
+                <wp:extent cx="4240848" cy="1124467"/>
+                <wp:effectExtent b="0" l="0" r="0" t="0"/>
+                <wp:wrapNone/>
+                <wp:docPr id="1" name=""/>
+                <a:graphic>
+                  <a:graphicData uri="http://schemas.microsoft.com/office/word/2010/wordprocessingShape">
+                    <wps:wsp>
+                      <wps:cNvSpPr txBox="1"/>
+                      <wps:cNvPr id="2" name="Shape 2"/>
+                      <wps:spPr>
+                        <a:xfrm>
+                          <a:off x="619200" y="416200"/>
+                          <a:ext cx="6445800" cy="1693200"/>
+                        </a:xfrm>
+                        <a:prstGeom prst="rect">
+                          <a:avLst/>
+                        </a:prstGeom>
+                        <a:noFill/>
+                        <a:ln>
+                          <a:noFill/>
+                        </a:ln>
+                      </wps:spPr>
+                      <wps:txbx>
+                        <w:txbxContent>
+                          <w:p>
+                            <w:pPr>
+                              <w:spacing w:after="0" w:before="0" w:line="240"/>
+                              <w:ind w:left="0" w:right="0" w:firstLine="0"/>
+                              <w:jc w:val="left"/>
+                              <w:textDirection w:val="btLr"/>
+                            </w:pPr>
+                            <w:r>
+                              <w:rPr>
+                                <w:rFonts w:ascii="Trebuchet MS" w:cs="Trebuchet MS" w:eastAsia="Trebuchet MS" w:hAnsi="Trebuchet MS"/>
+                                <w:b w:val="0"/>
+                                <w:i w:val="0"/>
+                                <w:smallCaps w:val="0"/>
+                                <w:strike w:val="0"/>
+                                <w:color w:val="000000"/>
+                                <w:sz w:val="28"/>
+                                <w:vertAlign w:val="baseline"/>
+                              </w:rPr>
+                              <w:t xml:space="preserve">Bank Name：KeyBank</w:t>
+                            </w:r>
+                          </w:p>
+                          <w:p>
+                            <w:pPr>
+                              <w:spacing w:after="0" w:before="0" w:line="240"/>
+                              <w:ind w:left="0" w:right="0" w:firstLine="0"/>
+                              <w:jc w:val="left"/>
+                              <w:textDirection w:val="btLr"/>
+                            </w:pPr>
+                            <w:r>
+                              <w:rPr>
+                                <w:rFonts w:ascii="Trebuchet MS" w:cs="Trebuchet MS" w:eastAsia="Trebuchet MS" w:hAnsi="Trebuchet MS"/>
+                                <w:b w:val="0"/>
+                                <w:i w:val="0"/>
+                                <w:smallCaps w:val="0"/>
+                                <w:strike w:val="0"/>
+                                <w:color w:val="000000"/>
+                                <w:sz w:val="28"/>
+                                <w:vertAlign w:val="baseline"/>
+                              </w:rPr>
+                            </w:r>
+                            <w:r>
+                              <w:rPr>
+                                <w:rFonts w:ascii="Trebuchet MS" w:cs="Trebuchet MS" w:eastAsia="Trebuchet MS" w:hAnsi="Trebuchet MS"/>
+                                <w:b w:val="0"/>
+                                <w:i w:val="0"/>
+                                <w:smallCaps w:val="0"/>
+                                <w:strike w:val="0"/>
+                                <w:color w:val="000000"/>
+                                <w:sz w:val="28"/>
+                                <w:vertAlign w:val="baseline"/>
+                              </w:rPr>
+                              <w:t xml:space="preserve">LogFresh Address for cheque: 708N 29th Ave, Apt2, Yakima, WA 98902</w:t>
+                            </w:r>
+                          </w:p>
+                          <w:p>
+                            <w:pPr>
+                              <w:spacing w:after="0" w:before="0" w:line="240"/>
+                              <w:ind w:left="0" w:right="0" w:firstLine="0"/>
+                              <w:jc w:val="left"/>
+                              <w:textDirection w:val="btLr"/>
+                            </w:pPr>
+                            <w:r>
+                              <w:rPr>
+                                <w:rFonts w:ascii="Trebuchet MS" w:cs="Trebuchet MS" w:eastAsia="Trebuchet MS" w:hAnsi="Trebuchet MS"/>
+                                <w:b w:val="0"/>
+                                <w:i w:val="0"/>
+                                <w:smallCaps w:val="0"/>
+                                <w:strike w:val="0"/>
+                                <w:color w:val="000000"/>
+                                <w:sz w:val="28"/>
+                                <w:vertAlign w:val="baseline"/>
+                              </w:rPr>
+                            </w:r>
+                            <w:r>
+                              <w:rPr>
+                                <w:rFonts w:ascii="Trebuchet MS" w:cs="Trebuchet MS" w:eastAsia="Trebuchet MS" w:hAnsi="Trebuchet MS"/>
+                                <w:b w:val="0"/>
+                                <w:i w:val="0"/>
+                                <w:smallCaps w:val="0"/>
+                                <w:strike w:val="0"/>
+                                <w:color w:val="000000"/>
+                                <w:sz w:val="28"/>
+                                <w:vertAlign w:val="baseline"/>
+                              </w:rPr>
+                              <w:t xml:space="preserve">Beneficiary Name: LOGFRESH BIOTECHNOLOGY CO.LTD</w:t>
+                            </w:r>
+                          </w:p>
+                          <w:p>
+                            <w:pPr>
+                              <w:spacing w:after="0" w:before="0" w:line="240"/>
+                              <w:ind w:left="0" w:right="0" w:firstLine="0"/>
+                              <w:jc w:val="left"/>
+                              <w:textDirection w:val="btLr"/>
+                            </w:pPr>
+                            <w:r>
+                              <w:rPr>
+                                <w:rFonts w:ascii="Trebuchet MS" w:cs="Trebuchet MS" w:eastAsia="Trebuchet MS" w:hAnsi="Trebuchet MS"/>
+                                <w:b w:val="0"/>
+                                <w:i w:val="0"/>
+                                <w:smallCaps w:val="0"/>
+                                <w:strike w:val="0"/>
+                                <w:color w:val="000000"/>
+                                <w:sz w:val="28"/>
+                                <w:vertAlign w:val="baseline"/>
+                              </w:rPr>
+                            </w:r>
+                            <w:r>
+                              <w:rPr>
+                                <w:rFonts w:ascii="Trebuchet MS" w:cs="Trebuchet MS" w:eastAsia="Trebuchet MS" w:hAnsi="Trebuchet MS"/>
+                                <w:b w:val="0"/>
+                                <w:i w:val="0"/>
+                                <w:smallCaps w:val="0"/>
+                                <w:strike w:val="0"/>
+                                <w:color w:val="000000"/>
+                                <w:sz w:val="28"/>
+                                <w:vertAlign w:val="baseline"/>
+                              </w:rPr>
+                              <w:t xml:space="preserve">Beneficiary Account: 478621671500</w:t>
+                            </w:r>
+                          </w:p>
+                          <w:p>
+                            <w:pPr>
+                              <w:spacing w:after="0" w:before="0" w:line="240"/>
+                              <w:ind w:left="0" w:right="0" w:firstLine="0"/>
+                              <w:jc w:val="left"/>
+                              <w:textDirection w:val="btLr"/>
+                            </w:pPr>
+                            <w:r>
+                              <w:rPr>
+                                <w:rFonts w:ascii="Trebuchet MS" w:cs="Trebuchet MS" w:eastAsia="Trebuchet MS" w:hAnsi="Trebuchet MS"/>
+                                <w:b w:val="0"/>
+                                <w:i w:val="0"/>
+                                <w:smallCaps w:val="0"/>
+                                <w:strike w:val="0"/>
+                                <w:color w:val="000000"/>
+                                <w:sz w:val="28"/>
+                                <w:vertAlign w:val="baseline"/>
+                              </w:rPr>
+                            </w:r>
+                            <w:r>
+                              <w:rPr>
+                                <w:rFonts w:ascii="Trebuchet MS" w:cs="Trebuchet MS" w:eastAsia="Trebuchet MS" w:hAnsi="Trebuchet MS"/>
+                                <w:b w:val="0"/>
+                                <w:i w:val="0"/>
+                                <w:smallCaps w:val="0"/>
+                                <w:strike w:val="0"/>
+                                <w:color w:val="000000"/>
+                                <w:sz w:val="28"/>
+                                <w:vertAlign w:val="baseline"/>
+                              </w:rPr>
+                              <w:t xml:space="preserve">SWIFT Code: KEYBUS33 (international wires only)</w:t>
+                            </w:r>
+                          </w:p>
+                          <w:p>
+                            <w:pPr>
+                              <w:spacing w:after="0" w:before="0" w:line="240"/>
+                              <w:ind w:left="0" w:right="0" w:firstLine="0"/>
+                              <w:jc w:val="left"/>
+                              <w:textDirection w:val="btLr"/>
+                            </w:pPr>
+                            <w:r>
+                              <w:rPr>
+                                <w:rFonts w:ascii="Trebuchet MS" w:cs="Trebuchet MS" w:eastAsia="Trebuchet MS" w:hAnsi="Trebuchet MS"/>
+                                <w:b w:val="0"/>
+                                <w:i w:val="0"/>
+                                <w:smallCaps w:val="0"/>
+                                <w:strike w:val="0"/>
+                                <w:color w:val="000000"/>
+                                <w:sz w:val="28"/>
+                                <w:vertAlign w:val="baseline"/>
+                              </w:rPr>
+                            </w:r>
+                            <w:r>
+                              <w:rPr>
+                                <w:rFonts w:ascii="Trebuchet MS" w:cs="Trebuchet MS" w:eastAsia="Trebuchet MS" w:hAnsi="Trebuchet MS"/>
+                                <w:b w:val="0"/>
+                                <w:i w:val="0"/>
+                                <w:smallCaps w:val="0"/>
+                                <w:strike w:val="0"/>
+                                <w:color w:val="000000"/>
+                                <w:sz w:val="28"/>
+                                <w:vertAlign w:val="baseline"/>
+                              </w:rPr>
+                              <w:t xml:space="preserve">ABA Routing Number: (domestic wires or ACH) 125000574</w:t>
+                            </w:r>
+                          </w:p>
+                          <w:p>
+                            <w:pPr>
+                              <w:spacing w:after="0" w:before="0" w:line="240"/>
+                              <w:ind w:left="0" w:right="0" w:firstLine="0"/>
+                              <w:jc w:val="left"/>
+                              <w:textDirection w:val="btLr"/>
+                            </w:pPr>
+                            <w:r>
+                              <w:rPr>
+                                <w:rFonts w:ascii="Trebuchet MS" w:cs="Trebuchet MS" w:eastAsia="Trebuchet MS" w:hAnsi="Trebuchet MS"/>
+                                <w:b w:val="0"/>
+                                <w:i w:val="0"/>
+                                <w:smallCaps w:val="0"/>
+                                <w:strike w:val="0"/>
+                                <w:color w:val="000000"/>
+                                <w:sz w:val="28"/>
+                                <w:vertAlign w:val="baseline"/>
+                              </w:rPr>
+                            </w:r>
+                          </w:p>
+                        </w:txbxContent>
+                      </wps:txbx>
+                      <wps:bodyPr anchorCtr="0" anchor="t" bIns="91425" lIns="91425" spcFirstLastPara="1" rIns="91425" wrap="square" tIns="91425">
+                        <a:spAutoFit/>
+                      </wps:bodyPr>
+                    </wps:wsp>
+                  </a:graphicData>
+                </a:graphic>
+              </wp:anchor>
+            </w:drawing>
+          </mc:Choice>
+          <mc:Fallback>
+            <w:drawing>
+              <wp:anchor allowOverlap="1" behindDoc="1" distB="114300" distT="114300" distL="114300" distR="114300" hidden="0" layoutInCell="1" locked="0" relativeHeight="0" simplePos="0">
+                <wp:simplePos x="0" y="0"/>
+                <wp:positionH relativeFrom="page">
+                  <wp:posOffset>621665</wp:posOffset>
+                </wp:positionH>
+                <wp:positionV relativeFrom="page">
+                  <wp:posOffset>8477250</wp:posOffset>
+                </wp:positionV>
+                <wp:extent cx="4240848" cy="1124467"/>
+                <wp:effectExtent b="0" l="0" r="0" t="0"/>
+                <wp:wrapNone/>
+                <wp:docPr id="1" name="image2.png"/>
+                <a:graphic>
+                  <a:graphicData uri="http://schemas.openxmlformats.org/drawingml/2006/picture">
+                    <pic:pic>
+                      <pic:nvPicPr>
+                        <pic:cNvPr id="0" name="image2.png"/>
+                        <pic:cNvPicPr preferRelativeResize="0"/>
+                      </pic:nvPicPr>
+                      <pic:blipFill>
+                        <a:blip r:embed="rId7"/>
+                        <a:srcRect/>
+                        <a:stretch>
+                          <a:fillRect/>
+                        </a:stretch>
+                      </pic:blipFill>
+                      <pic:spPr>
+                        <a:xfrm>
+                          <a:off x="0" y="0"/>
+                          <a:ext cx="4240848" cy="1124467"/>
+                        </a:xfrm>
+                        <a:prstGeom prst="rect"/>
+                        <a:ln/>
+                      </pic:spPr>
+                    </pic:pic>
+                  </a:graphicData>
+                </a:graphic>
+              </wp:anchor>
+            </w:drawing>
+          </mc:Fallback>
+        </mc:AlternateContent>
+      </w:r>
       <w:r>
         <w:rPr>
           <w:rFonts w:ascii="Trebuchet MS" w:cs="Trebuchet MS" w:eastAsia="Trebuchet MS" w:hAnsi="Trebuchet MS"/>
@@ -2641,8 +3170,8 @@
           <w:i w:val="1"/>
           <w:iCs w:val="1"/>
           <w:color w:val="f39a05"/>
-          <w:sz w:val="21"/>
-          <w:szCs w:val="21"/>
+          <w:sz w:val="23"/>
+          <w:szCs w:val="23"/>
           <w:rtl w:val="0"/>
         </w:rPr>
         <w:t xml:space="preserve">Thank you for your business.</w:t>
@@ -2690,7 +3219,10 @@
             <w:pPr>
               <w:spacing w:after="0" w:before="0" w:line="240" w:lineRule="auto"/>
               <w:jc w:val="left"/>
-              <w:rPr/>
+              <w:rPr>
+                <w:sz w:val="21"/>
+                <w:szCs w:val="21"/>
+              </w:rPr>
             </w:pPr>
             <w:r>
               <w:rPr>
@@ -2700,8 +3232,8 @@
                 <w:i w:val="0"/>
                 <w:iCs w:val="0"/>
                 <w:color w:val="303030"/>
-                <w:sz w:val="16"/>
-                <w:szCs w:val="16"/>
+                <w:sz w:val="18"/>
+                <w:szCs w:val="18"/>
                 <w:rtl w:val="0"/>
               </w:rPr>
               <w:t xml:space="preserve">SUBTOTAL</w:t>
@@ -2727,7 +3259,10 @@
             <w:pPr>
               <w:spacing w:after="0" w:before="0" w:line="240" w:lineRule="auto"/>
               <w:jc w:val="right"/>
-              <w:rPr/>
+              <w:rPr>
+                <w:sz w:val="21"/>
+                <w:szCs w:val="21"/>
+              </w:rPr>
             </w:pPr>
             <w:r>
               <w:rPr>
@@ -2737,8 +3272,8 @@
                 <w:i w:val="0"/>
                 <w:iCs w:val="0"/>
                 <w:color w:val="303030"/>
-                <w:sz w:val="16"/>
-                <w:szCs w:val="16"/>
+                <w:sz w:val="18"/>
+                <w:szCs w:val="18"/>
                 <w:rtl w:val="0"/>
               </w:rPr>
               <w:t xml:space="preserve">{{SUBTOTAL}}</w:t>
@@ -2770,7 +3305,10 @@
             <w:pPr>
               <w:spacing w:after="0" w:before="0" w:line="240" w:lineRule="auto"/>
               <w:jc w:val="left"/>
-              <w:rPr/>
+              <w:rPr>
+                <w:sz w:val="21"/>
+                <w:szCs w:val="21"/>
+              </w:rPr>
             </w:pPr>
             <w:r>
               <w:rPr>
@@ -2780,8 +3318,8 @@
                 <w:i w:val="0"/>
                 <w:iCs w:val="0"/>
                 <w:color w:val="303030"/>
-                <w:sz w:val="16"/>
-                <w:szCs w:val="16"/>
+                <w:sz w:val="18"/>
+                <w:szCs w:val="18"/>
                 <w:rtl w:val="0"/>
               </w:rPr>
               <w:t xml:space="preserve">DISCOUNT</w:t>
@@ -2807,7 +3345,10 @@
             <w:pPr>
               <w:spacing w:after="0" w:before="0" w:line="240" w:lineRule="auto"/>
               <w:jc w:val="right"/>
-              <w:rPr/>
+              <w:rPr>
+                <w:sz w:val="21"/>
+                <w:szCs w:val="21"/>
+              </w:rPr>
             </w:pPr>
             <w:r>
               <w:rPr>
@@ -2817,8 +3358,8 @@
                 <w:i w:val="0"/>
                 <w:iCs w:val="0"/>
                 <w:color w:val="303030"/>
-                <w:sz w:val="16"/>
-                <w:szCs w:val="16"/>
+                <w:sz w:val="18"/>
+                <w:szCs w:val="18"/>
                 <w:rtl w:val="0"/>
               </w:rPr>
               <w:t xml:space="preserve">{{DISCOUNT}}</w:t>
@@ -2850,7 +3391,10 @@
             <w:pPr>
               <w:spacing w:after="0" w:before="0" w:line="240" w:lineRule="auto"/>
               <w:jc w:val="left"/>
-              <w:rPr/>
+              <w:rPr>
+                <w:sz w:val="21"/>
+                <w:szCs w:val="21"/>
+              </w:rPr>
             </w:pPr>
             <w:r>
               <w:rPr>
@@ -2860,8 +3404,8 @@
                 <w:i w:val="0"/>
                 <w:iCs w:val="0"/>
                 <w:color w:val="303030"/>
-                <w:sz w:val="16"/>
-                <w:szCs w:val="16"/>
+                <w:sz w:val="18"/>
+                <w:szCs w:val="18"/>
                 <w:rtl w:val="0"/>
               </w:rPr>
               <w:t xml:space="preserve">SHIPPING</w:t>
@@ -2887,7 +3431,10 @@
             <w:pPr>
               <w:spacing w:after="0" w:before="0" w:line="240" w:lineRule="auto"/>
               <w:jc w:val="right"/>
-              <w:rPr/>
+              <w:rPr>
+                <w:sz w:val="21"/>
+                <w:szCs w:val="21"/>
+              </w:rPr>
             </w:pPr>
             <w:r>
               <w:rPr>
@@ -2897,8 +3444,8 @@
                 <w:i w:val="0"/>
                 <w:iCs w:val="0"/>
                 <w:color w:val="303030"/>
-                <w:sz w:val="16"/>
-                <w:szCs w:val="16"/>
+                <w:sz w:val="18"/>
+                <w:szCs w:val="18"/>
                 <w:rtl w:val="0"/>
               </w:rPr>
               <w:t xml:space="preserve">{{SHIPPING}}</w:t>
@@ -2921,6 +3468,7 @@
             <w:tcBorders>
               <w:bottom w:color="e6e8e6" w:space="0" w:sz="4" w:val="single"/>
             </w:tcBorders>
+            <w:shd w:fill="fff4e2" w:val="clear"/>
             <w:tcMar>
               <w:top w:w="85.0" w:type="dxa"/>
               <w:bottom w:w="85.0" w:type="dxa"/>
@@ -2930,7 +3478,10 @@
             <w:pPr>
               <w:spacing w:after="0" w:before="0" w:line="240" w:lineRule="auto"/>
               <w:jc w:val="left"/>
-              <w:rPr/>
+              <w:rPr>
+                <w:sz w:val="21"/>
+                <w:szCs w:val="21"/>
+              </w:rPr>
             </w:pPr>
             <w:r>
               <w:rPr>
@@ -2940,24 +3491,25 @@
                 <w:i w:val="0"/>
                 <w:iCs w:val="0"/>
                 <w:color w:val="303030"/>
-                <w:sz w:val="16"/>
-                <w:szCs w:val="16"/>
-                <w:rtl w:val="0"/>
-              </w:rPr>
-              <w:t xml:space="preserve">TAX</w:t>
-            </w:r>
-            <w:r>
-              <w:rPr>
-                <w:rtl w:val="0"/>
-              </w:rPr>
-            </w:r>
-          </w:p>
-        </w:tc>
-        <w:tc>
-          <w:tcPr>
-            <w:tcBorders>
-              <w:bottom w:color="e6e8e6" w:space="0" w:sz="4" w:val="single"/>
-            </w:tcBorders>
+                <w:sz w:val="20"/>
+                <w:szCs w:val="20"/>
+                <w:rtl w:val="0"/>
+              </w:rPr>
+              <w:t xml:space="preserve">TOTAL</w:t>
+            </w:r>
+            <w:r>
+              <w:rPr>
+                <w:rtl w:val="0"/>
+              </w:rPr>
+            </w:r>
+          </w:p>
+        </w:tc>
+        <w:tc>
+          <w:tcPr>
+            <w:tcBorders>
+              <w:bottom w:color="e6e8e6" w:space="0" w:sz="4" w:val="single"/>
+            </w:tcBorders>
+            <w:shd w:fill="fff4e2" w:val="clear"/>
             <w:tcMar>
               <w:top w:w="85.0" w:type="dxa"/>
               <w:bottom w:w="85.0" w:type="dxa"/>
@@ -2967,7 +3519,10 @@
             <w:pPr>
               <w:spacing w:after="0" w:before="0" w:line="240" w:lineRule="auto"/>
               <w:jc w:val="right"/>
-              <w:rPr/>
+              <w:rPr>
+                <w:sz w:val="21"/>
+                <w:szCs w:val="21"/>
+              </w:rPr>
             </w:pPr>
             <w:r>
               <w:rPr>
@@ -2977,11 +3532,11 @@
                 <w:i w:val="0"/>
                 <w:iCs w:val="0"/>
                 <w:color w:val="303030"/>
-                <w:sz w:val="16"/>
-                <w:szCs w:val="16"/>
-                <w:rtl w:val="0"/>
-              </w:rPr>
-              <w:t xml:space="preserve">{{TAX}}</w:t>
+                <w:sz w:val="21"/>
+                <w:szCs w:val="21"/>
+                <w:rtl w:val="0"/>
+              </w:rPr>
+              <w:t xml:space="preserve">{{TOTAL}}</w:t>
             </w:r>
             <w:r>
               <w:rPr>
@@ -3001,7 +3556,7 @@
             <w:tcBorders>
               <w:bottom w:color="e6e8e6" w:space="0" w:sz="4" w:val="single"/>
             </w:tcBorders>
-            <w:shd w:fill="fff4e2" w:val="clear"/>
+            <w:shd w:fill="42ad3a" w:val="clear"/>
             <w:tcMar>
               <w:top w:w="85.0" w:type="dxa"/>
               <w:bottom w:w="85.0" w:type="dxa"/>
@@ -3011,7 +3566,10 @@
             <w:pPr>
               <w:spacing w:after="0" w:before="0" w:line="240" w:lineRule="auto"/>
               <w:jc w:val="left"/>
-              <w:rPr/>
+              <w:rPr>
+                <w:sz w:val="21"/>
+                <w:szCs w:val="21"/>
+              </w:rPr>
             </w:pPr>
             <w:r>
               <w:rPr>
@@ -3020,26 +3578,26 @@
                 <w:bCs w:val="1"/>
                 <w:i w:val="0"/>
                 <w:iCs w:val="0"/>
-                <w:color w:val="303030"/>
-                <w:sz w:val="18"/>
-                <w:szCs w:val="18"/>
-                <w:rtl w:val="0"/>
-              </w:rPr>
-              <w:t xml:space="preserve">TOTAL</w:t>
-            </w:r>
-            <w:r>
-              <w:rPr>
-                <w:rtl w:val="0"/>
-              </w:rPr>
-            </w:r>
-          </w:p>
-        </w:tc>
-        <w:tc>
-          <w:tcPr>
-            <w:tcBorders>
-              <w:bottom w:color="e6e8e6" w:space="0" w:sz="4" w:val="single"/>
-            </w:tcBorders>
-            <w:shd w:fill="fff4e2" w:val="clear"/>
+                <w:color w:val="ffffff"/>
+                <w:sz w:val="20"/>
+                <w:szCs w:val="20"/>
+                <w:rtl w:val="0"/>
+              </w:rPr>
+              <w:t xml:space="preserve">BALANCE DUE</w:t>
+            </w:r>
+            <w:r>
+              <w:rPr>
+                <w:rtl w:val="0"/>
+              </w:rPr>
+            </w:r>
+          </w:p>
+        </w:tc>
+        <w:tc>
+          <w:tcPr>
+            <w:tcBorders>
+              <w:bottom w:color="e6e8e6" w:space="0" w:sz="4" w:val="single"/>
+            </w:tcBorders>
+            <w:shd w:fill="42ad3a" w:val="clear"/>
             <w:tcMar>
               <w:top w:w="85.0" w:type="dxa"/>
               <w:bottom w:w="85.0" w:type="dxa"/>
@@ -3049,7 +3607,10 @@
             <w:pPr>
               <w:spacing w:after="0" w:before="0" w:line="240" w:lineRule="auto"/>
               <w:jc w:val="right"/>
-              <w:rPr/>
+              <w:rPr>
+                <w:sz w:val="21"/>
+                <w:szCs w:val="21"/>
+              </w:rPr>
             </w:pPr>
             <w:r>
               <w:rPr>
@@ -3058,91 +3619,9 @@
                 <w:bCs w:val="1"/>
                 <w:i w:val="0"/>
                 <w:iCs w:val="0"/>
-                <w:color w:val="303030"/>
-                <w:sz w:val="19"/>
-                <w:szCs w:val="19"/>
-                <w:rtl w:val="0"/>
-              </w:rPr>
-              <w:t xml:space="preserve">{{TOTAL}}</w:t>
-            </w:r>
-            <w:r>
-              <w:rPr>
-                <w:rtl w:val="0"/>
-              </w:rPr>
-            </w:r>
-          </w:p>
-        </w:tc>
-      </w:tr>
-      <w:tr>
-        <w:trPr>
-          <w:cantSplit w:val="0"/>
-          <w:tblHeader w:val="0"/>
-        </w:trPr>
-        <w:tc>
-          <w:tcPr>
-            <w:tcBorders>
-              <w:bottom w:color="e6e8e6" w:space="0" w:sz="4" w:val="single"/>
-            </w:tcBorders>
-            <w:shd w:fill="42ad3a" w:val="clear"/>
-            <w:tcMar>
-              <w:top w:w="85.0" w:type="dxa"/>
-              <w:bottom w:w="85.0" w:type="dxa"/>
-            </w:tcMar>
-          </w:tcPr>
-          <w:p>
-            <w:pPr>
-              <w:spacing w:after="0" w:before="0" w:line="240" w:lineRule="auto"/>
-              <w:jc w:val="left"/>
-              <w:rPr/>
-            </w:pPr>
-            <w:r>
-              <w:rPr>
-                <w:rFonts w:ascii="Trebuchet MS" w:cs="Trebuchet MS" w:eastAsia="Trebuchet MS" w:hAnsi="Trebuchet MS"/>
-                <w:b w:val="1"/>
-                <w:bCs w:val="1"/>
-                <w:i w:val="0"/>
-                <w:iCs w:val="0"/>
                 <w:color w:val="ffffff"/>
-                <w:sz w:val="18"/>
-                <w:szCs w:val="18"/>
-                <w:rtl w:val="0"/>
-              </w:rPr>
-              <w:t xml:space="preserve">BALANCE DUE</w:t>
-            </w:r>
-            <w:r>
-              <w:rPr>
-                <w:rtl w:val="0"/>
-              </w:rPr>
-            </w:r>
-          </w:p>
-        </w:tc>
-        <w:tc>
-          <w:tcPr>
-            <w:tcBorders>
-              <w:bottom w:color="e6e8e6" w:space="0" w:sz="4" w:val="single"/>
-            </w:tcBorders>
-            <w:shd w:fill="42ad3a" w:val="clear"/>
-            <w:tcMar>
-              <w:top w:w="85.0" w:type="dxa"/>
-              <w:bottom w:w="85.0" w:type="dxa"/>
-            </w:tcMar>
-          </w:tcPr>
-          <w:p>
-            <w:pPr>
-              <w:spacing w:after="0" w:before="0" w:line="240" w:lineRule="auto"/>
-              <w:jc w:val="right"/>
-              <w:rPr/>
-            </w:pPr>
-            <w:r>
-              <w:rPr>
-                <w:rFonts w:ascii="Trebuchet MS" w:cs="Trebuchet MS" w:eastAsia="Trebuchet MS" w:hAnsi="Trebuchet MS"/>
-                <w:b w:val="1"/>
-                <w:bCs w:val="1"/>
-                <w:i w:val="0"/>
-                <w:iCs w:val="0"/>
-                <w:color w:val="ffffff"/>
-                <w:sz w:val="19"/>
-                <w:szCs w:val="19"/>
+                <w:sz w:val="21"/>
+                <w:szCs w:val="21"/>
                 <w:rtl w:val="0"/>
               </w:rPr>
               <w:t xml:space="preserve">{{BALANCE_DUE}}</w:t>
@@ -3173,7 +3652,10 @@
         <w:spacing w:after="0" w:before="0" w:line="276" w:lineRule="auto"/>
         <w:ind w:left="0" w:right="0" w:firstLine="0"/>
         <w:jc w:val="left"/>
-        <w:rPr/>
+        <w:rPr>
+          <w:sz w:val="21"/>
+          <w:szCs w:val="21"/>
+        </w:rPr>
       </w:pPr>
       <w:r>
         <w:rPr>
@@ -3182,7 +3664,7 @@
       </w:r>
     </w:p>
     <w:sectPr>
-      <w:footerReference r:id="rId7" w:type="default"/>
+      <w:footerReference r:id="rId8" w:type="default"/>
       <w:pgSz w:h="15840" w:w="12240" w:orient="portrait"/>
       <w:pgMar w:bottom="720" w:top="835" w:left="979" w:right="979" w:header="288" w:footer="288"/>
       <w:pgNumType w:start="1"/>
@@ -3197,7 +3679,6 @@
     <w:pPr>
       <w:keepNext w:val="0"/>
       <w:keepLines w:val="0"/>
-      <w:pageBreakBefore w:val="0"/>
       <w:widowControl w:val="1"/>
       <w:pBdr>
         <w:top w:space="0" w:sz="0" w:val="nil"/>
@@ -3223,8 +3704,8 @@
         <w:smallCaps w:val="0"/>
         <w:strike w:val="0"/>
         <w:color w:val="000000"/>
-        <w:sz w:val="19"/>
-        <w:szCs w:val="19"/>
+        <w:sz w:val="21"/>
+        <w:szCs w:val="21"/>
         <w:u w:val="none"/>
         <w:shd w:fill="auto" w:val="clear"/>
         <w:vertAlign w:val="baseline"/>
@@ -3233,8 +3714,8 @@
     <w:r>
       <w:rPr>
         <w:color w:val="666666"/>
-        <w:sz w:val="16"/>
-        <w:szCs w:val="16"/>
+        <w:sz w:val="18"/>
+        <w:szCs w:val="18"/>
         <w:rtl w:val="0"/>
       </w:rPr>
       <w:t xml:space="preserve">www.logfresh.net</w:t>
@@ -3249,8 +3730,8 @@
         <w:smallCaps w:val="0"/>
         <w:strike w:val="0"/>
         <w:color w:val="666666"/>
-        <w:sz w:val="16"/>
-        <w:szCs w:val="16"/>
+        <w:sz w:val="18"/>
+        <w:szCs w:val="18"/>
         <w:u w:val="none"/>
         <w:shd w:fill="auto" w:val="clear"/>
         <w:vertAlign w:val="baseline"/>
@@ -3261,8 +3742,8 @@
     <w:r>
       <w:rPr>
         <w:color w:val="666666"/>
-        <w:sz w:val="16"/>
-        <w:szCs w:val="16"/>
+        <w:sz w:val="18"/>
+        <w:szCs w:val="18"/>
         <w:rtl w:val="0"/>
       </w:rPr>
       <w:t xml:space="preserve">sales@awt-biotech.com</w:t>

</xml_diff>

<commit_message>
Update invoice and order confirmation templates
</commit_message>
<xml_diff>
--- a/templates/Harvest_Smart_Invoice_Template_Strict.docx
+++ b/templates/Harvest_Smart_Invoice_Template_Strict.docx
@@ -86,12 +86,12 @@
                 <wp:inline distB="0" distT="0" distL="114300" distR="114300">
                   <wp:extent cx="2880360" cy="1002596"/>
                   <wp:effectExtent b="0" l="0" r="0" t="0"/>
-                  <wp:docPr id="2" name="image1.png"/>
+                  <wp:docPr id="2" name="image2.png"/>
                   <a:graphic>
                     <a:graphicData uri="http://schemas.openxmlformats.org/drawingml/2006/picture">
                       <pic:pic>
                         <pic:nvPicPr>
-                          <pic:cNvPr id="0" name="image1.png"/>
+                          <pic:cNvPr id="0" name="image2.png"/>
                           <pic:cNvPicPr preferRelativeResize="0"/>
                         </pic:nvPicPr>
                         <pic:blipFill>
@@ -300,7 +300,7 @@
           <w:szCs w:val="18"/>
           <w:rtl w:val="0"/>
         </w:rPr>
-        <w:t xml:space="preserve">LogFresh Biotechnology CO., LTD</w:t>
+        <w:t xml:space="preserve">Logfresh Biotechnology Co., LTD</w:t>
       </w:r>
       <w:r>
         <w:rPr>
@@ -323,7 +323,7 @@
           <w:szCs w:val="18"/>
           <w:rtl w:val="0"/>
         </w:rPr>
-        <w:t xml:space="preserve">708 N 29th Avenue, Unit2, Yakima, WA 98902  </w:t>
+        <w:t xml:space="preserve">708 N 29th Avenue, Unit 2, Yakima, WA 98902  </w:t>
       </w:r>
       <w:r>
         <w:rPr>
@@ -2877,7 +2877,7 @@
                 <wp:positionV relativeFrom="page">
                   <wp:posOffset>8477250</wp:posOffset>
                 </wp:positionV>
-                <wp:extent cx="4240848" cy="1124467"/>
+                <wp:extent cx="4240848" cy="1124231"/>
                 <wp:effectExtent b="0" l="0" r="0" t="0"/>
                 <wp:wrapNone/>
                 <wp:docPr id="1" name=""/>
@@ -2952,7 +2952,7 @@
                                 <w:sz w:val="28"/>
                                 <w:vertAlign w:val="baseline"/>
                               </w:rPr>
-                              <w:t xml:space="preserve">LogFresh Address for cheque: 708N 29th Ave, Apt2, Yakima, WA 98902</w:t>
+                              <w:t xml:space="preserve">LogFresh Address for check: 708 N 29th Ave, Unit 2, Yakima, WA 98902</w:t>
                             </w:r>
                           </w:p>
                           <w:p>
@@ -3128,15 +3128,15 @@
                 <wp:positionV relativeFrom="page">
                   <wp:posOffset>8477250</wp:posOffset>
                 </wp:positionV>
-                <wp:extent cx="4240848" cy="1124467"/>
+                <wp:extent cx="4240848" cy="1124231"/>
                 <wp:effectExtent b="0" l="0" r="0" t="0"/>
                 <wp:wrapNone/>
-                <wp:docPr id="1" name="image2.png"/>
+                <wp:docPr id="1" name="image1.png"/>
                 <a:graphic>
                   <a:graphicData uri="http://schemas.openxmlformats.org/drawingml/2006/picture">
                     <pic:pic>
                       <pic:nvPicPr>
-                        <pic:cNvPr id="0" name="image2.png"/>
+                        <pic:cNvPr id="0" name="image1.png"/>
                         <pic:cNvPicPr preferRelativeResize="0"/>
                       </pic:nvPicPr>
                       <pic:blipFill>
@@ -3149,7 +3149,7 @@
                       <pic:spPr>
                         <a:xfrm>
                           <a:off x="0" y="0"/>
-                          <a:ext cx="4240848" cy="1124467"/>
+                          <a:ext cx="4240848" cy="1124231"/>
                         </a:xfrm>
                         <a:prstGeom prst="rect"/>
                         <a:ln/>

</xml_diff>

<commit_message>
Update company suffix casing in templates
</commit_message>
<xml_diff>
--- a/templates/Harvest_Smart_Invoice_Template_Strict.docx
+++ b/templates/Harvest_Smart_Invoice_Template_Strict.docx
@@ -300,7 +300,7 @@
           <w:szCs w:val="18"/>
           <w:rtl w:val="0"/>
         </w:rPr>
-        <w:t xml:space="preserve">Logfresh Biotechnology Co., LTD</w:t>
+        <w:t>Logfresh Biotechnology Co., Ltd</w:t>
       </w:r>
       <w:r>
         <w:rPr>
@@ -3665,6 +3665,7 @@
     </w:p>
     <w:sectPr>
       <w:footerReference r:id="rId8" w:type="default"/>
+      <w:headerReference w:type="default" r:id="rId9"/>
       <w:pgSz w:h="15840" w:w="12240" w:orient="portrait"/>
       <w:pgMar w:bottom="720" w:top="835" w:left="979" w:right="979" w:header="288" w:footer="288"/>
       <w:pgNumType w:start="1"/>
@@ -3755,6 +3756,16 @@
     </w:r>
   </w:p>
 </w:ftr>
+</file>
+
+<file path=word/header1.xml><?xml version="1.0" encoding="utf-8"?>
+<w:hdr xmlns:m="http://schemas.openxmlformats.org/officeDocument/2006/math" xmlns:mc="http://schemas.openxmlformats.org/markup-compatibility/2006" xmlns:mo="http://schemas.microsoft.com/office/mac/office/2008/main" xmlns:mv="urn:schemas-microsoft-com:mac:vml" xmlns:o="urn:schemas-microsoft-com:office:office" xmlns:r="http://schemas.openxmlformats.org/officeDocument/2006/relationships" xmlns:v="urn:schemas-microsoft-com:vml" xmlns:w10="urn:schemas-microsoft-com:office:word" xmlns:w14="http://schemas.microsoft.com/office/word/2010/wordml" xmlns:w="http://schemas.openxmlformats.org/wordprocessingml/2006/main" xmlns:wne="http://schemas.microsoft.com/office/word/2006/wordml" xmlns:wp14="http://schemas.microsoft.com/office/word/2010/wordprocessingDrawing" xmlns:wp="http://schemas.openxmlformats.org/drawingml/2006/wordprocessingDrawing" xmlns:wpc="http://schemas.microsoft.com/office/word/2010/wordprocessingCanvas" xmlns:wpg="http://schemas.microsoft.com/office/word/2010/wordprocessingGroup" xmlns:wpi="http://schemas.microsoft.com/office/word/2010/wordprocessingInk" xmlns:wps="http://schemas.microsoft.com/office/word/2010/wordprocessingShape" mc:Ignorable="w14 wp14">
+  <w:p>
+    <w:pPr>
+      <w:pStyle w:val="Header"/>
+    </w:pPr>
+  </w:p>
+</w:hdr>
 </file>
 
 <file path=word/numbering.xml><?xml version="1.0" encoding="utf-8"?>

</xml_diff>